<commit_message>
cs chapter: apply the post-fix panel and match model-essay cadence
The evening re-read's cascade and single-seat welds are in the live
manuscript, the slop that the models do not write is cut, and the
exports are regenerated from that text.

Co-authored-by: Cursor <cursoragent@cursor.com>
</commit_message>
<xml_diff>
--- a/submissions/coordinative_sovereignty/chapter/Full Paper - Alg & Sov.docx
+++ b/submissions/coordinative_sovereignty/chapter/Full Paper - Alg & Sov.docx
@@ -49,19 +49,19 @@
         <w:t xml:space="preserve"> </w:t>
       </w:r>
       <w:r>
-        <w:t xml:space="preserve">coordination runs through an algorithmic third party that reads both and commits outcomes neither controls.</w:t>
-      </w:r>
-      <w:r>
-        <w:t xml:space="preserve"> </w:t>
-      </w:r>
-      <w:r>
-        <w:t xml:space="preserve">No prior competence reaches it. Governing it takes algorithmacy, those capacities indexed to the triad, and</w:t>
-      </w:r>
-      <w:r>
-        <w:t xml:space="preserve"> </w:t>
-      </w:r>
-      <w:r>
-        <w:t xml:space="preserve">a different sovereignty. Coordinative sovereignty is the standing to shape one’s terms of mediation, to</w:t>
+        <w:t xml:space="preserve">coordination runs through an algorithmic third party that reads both and commits outcomes neither controls,</w:t>
+      </w:r>
+      <w:r>
+        <w:t xml:space="preserve"> </w:t>
+      </w:r>
+      <w:r>
+        <w:t xml:space="preserve">which no prior competence reaches. Governing it takes algorithmacy, those capacities indexed to the triad,</w:t>
+      </w:r>
+      <w:r>
+        <w:t xml:space="preserve"> </w:t>
+      </w:r>
+      <w:r>
+        <w:t xml:space="preserve">and a different sovereignty. Coordinative sovereignty is the standing to shape one’s terms of mediation, to</w:t>
       </w:r>
       <w:r>
         <w:t xml:space="preserve"> </w:t>
@@ -183,31 +183,37 @@
         <w:t xml:space="preserve"> </w:t>
       </w:r>
       <w:r>
-        <w:t xml:space="preserve">govern them. Disclosure duties and complaint channels now reach parts of that layer, and section 3.2 takes</w:t>
-      </w:r>
-      <w:r>
-        <w:t xml:space="preserve"> </w:t>
-      </w:r>
-      <w:r>
-        <w:t xml:space="preserve">them up. They still leave the merchant whose listings disappear, and the creator whose audience vanishes in</w:t>
-      </w:r>
-      <w:r>
-        <w:t xml:space="preserve"> </w:t>
-      </w:r>
-      <w:r>
-        <w:t xml:space="preserve">a recommendation change announced nowhere, without standing over the determination that decided the</w:t>
-      </w:r>
-      <w:r>
-        <w:t xml:space="preserve"> </w:t>
-      </w:r>
-      <w:r>
-        <w:t xml:space="preserve">outcome. Compliance governs how these actors handle data. Their market positions are decided somewhere</w:t>
-      </w:r>
-      <w:r>
-        <w:t xml:space="preserve"> </w:t>
-      </w:r>
-      <w:r>
-        <w:t xml:space="preserve">else, inside the algorithmic systems through which the platform chooses what to surface and what to bury</w:t>
+        <w:t xml:space="preserve">govern them. Disclosure duties and complaint channels now reach parts of that layer, as section 3.2 takes</w:t>
+      </w:r>
+      <w:r>
+        <w:t xml:space="preserve"> </w:t>
+      </w:r>
+      <w:r>
+        <w:t xml:space="preserve">them up, and they still leave the merchant whose listings disappear, and the creator whose audience</w:t>
+      </w:r>
+      <w:r>
+        <w:t xml:space="preserve"> </w:t>
+      </w:r>
+      <w:r>
+        <w:t xml:space="preserve">vanishes in a recommendation change announced nowhere, without standing over the determination that decided</w:t>
+      </w:r>
+      <w:r>
+        <w:t xml:space="preserve"> </w:t>
+      </w:r>
+      <w:r>
+        <w:t xml:space="preserve">the outcome. Compliance governs how these actors handle data, while their market positions are decided</w:t>
+      </w:r>
+      <w:r>
+        <w:t xml:space="preserve"> </w:t>
+      </w:r>
+      <w:r>
+        <w:t xml:space="preserve">somewhere else, inside the algorithmic systems through which the platform chooses what to surface and what</w:t>
+      </w:r>
+      <w:r>
+        <w:t xml:space="preserve"> </w:t>
+      </w:r>
+      <w:r>
+        <w:t xml:space="preserve">to bury</w:t>
       </w:r>
       <w:r>
         <w:t xml:space="preserve"> </w:t>
@@ -289,7 +295,7 @@
         <w:t xml:space="preserve"> </w:t>
       </w:r>
       <w:r>
-        <w:t xml:space="preserve">it. What sets the situation apart can be put as a question about the coordination’s rules. Restore the</w:t>
+        <w:t xml:space="preserve">it, and what sets the situation apart is a question about the coordination’s rules. Restore the</w:t>
       </w:r>
       <w:r>
         <w:t xml:space="preserve"> </w:t>
@@ -339,7 +345,7 @@
         <w:t xml:space="preserve"> </w:t>
       </w:r>
       <w:r>
-        <w:t xml:space="preserve">mediation it cannot escape has not secured its autonomy. It has abandoned the field on which its autonomy</w:t>
+        <w:t xml:space="preserve">mediation it cannot escape has not secured its autonomy; it has abandoned the field on which its autonomy</w:t>
       </w:r>
       <w:r>
         <w:t xml:space="preserve"> </w:t>
@@ -365,7 +371,7 @@
         <w:pStyle w:val="BodyText"/>
       </w:pPr>
       <w:r>
-        <w:t xml:space="preserve">The alternative is coordinative sovereignty: standing within a coordination one cannot exit, the power to</w:t>
+        <w:t xml:space="preserve">The alternative is coordinative sovereignty: standing within a necessary mediation, the power to</w:t>
       </w:r>
       <w:r>
         <w:t xml:space="preserve"> </w:t>
@@ -377,19 +383,19 @@
         <w:t xml:space="preserve"> </w:t>
       </w:r>
       <w:r>
-        <w:t xml:space="preserve">the governance of the arrangement. Digital sovereignty asks who controls the infrastructure. Coordinative</w:t>
-      </w:r>
-      <w:r>
-        <w:t xml:space="preserve"> </w:t>
-      </w:r>
-      <w:r>
-        <w:t xml:space="preserve">sovereignty asks what autonomy remains for the actor coordinating through it. The two vary independently,</w:t>
-      </w:r>
-      <w:r>
-        <w:t xml:space="preserve"> </w:t>
-      </w:r>
-      <w:r>
-        <w:t xml:space="preserve">and the rest of the chapter tells them apart.</w:t>
+        <w:t xml:space="preserve">the governance of an arrangement the open tie does not dissolve. Where digital sovereignty asks who</w:t>
+      </w:r>
+      <w:r>
+        <w:t xml:space="preserve"> </w:t>
+      </w:r>
+      <w:r>
+        <w:t xml:space="preserve">controls the infrastructure, coordinative sovereignty asks what autonomy remains for the actor coordinating</w:t>
+      </w:r>
+      <w:r>
+        <w:t xml:space="preserve"> </w:t>
+      </w:r>
+      <w:r>
+        <w:t xml:space="preserve">through it. The two vary independently, and the rest of the chapter tells them apart.</w:t>
       </w:r>
     </w:p>
     <w:p>
@@ -409,7 +415,7 @@
         <w:t xml:space="preserve"> </w:t>
       </w:r>
       <w:r>
-        <w:t xml:space="preserve">term. The democratic tradition dissolved that difficulty long ago. Habermas (1996) describes popular</w:t>
+        <w:t xml:space="preserve">term. The democratic tradition dissolved that difficulty long ago, and Habermas (1996) describes popular</w:t>
       </w:r>
       <w:r>
         <w:t xml:space="preserve"> </w:t>
@@ -433,13 +439,13 @@
         <w:t xml:space="preserve"> </w:t>
       </w:r>
       <w:r>
-        <w:t xml:space="preserve">(pp. 486–487). Sovereignty in that sense is the standing to</w:t>
-      </w:r>
-      <w:r>
-        <w:t xml:space="preserve"> </w:t>
-      </w:r>
-      <w:r>
-        <w:t xml:space="preserve">hold power to account through the medium in which power is exercised, and it is the sense a literate public</w:t>
+        <w:t xml:space="preserve">(pp. 486–487). The term in that sense names the standing to</w:t>
+      </w:r>
+      <w:r>
+        <w:t xml:space="preserve"> </w:t>
+      </w:r>
+      <w:r>
+        <w:t xml:space="preserve">hold power to account through the medium in which power is exercised, which is what a literate public</w:t>
       </w:r>
       <w:r>
         <w:t xml:space="preserve"> </w:t>
@@ -451,7 +457,7 @@
         <w:t xml:space="preserve"> </w:t>
       </w:r>
       <w:r>
-        <w:t xml:space="preserve">mediation the actor cannot exit and a standing carried by voice, and so narrows the term’s extension.</w:t>
+        <w:t xml:space="preserve">necessary mediation and a standing carried by voice, and so narrows the term’s extension.</w:t>
       </w:r>
       <w:r>
         <w:t xml:space="preserve"> </w:t>
@@ -523,7 +529,7 @@
         <w:pStyle w:val="FirstParagraph"/>
       </w:pPr>
       <w:r>
-        <w:t xml:space="preserve">A competence that everyone has governs an authority everyone can contest. A competence held by a few</w:t>
+        <w:t xml:space="preserve">A competence that everyone has governs an authority everyone can contest; a competence held by a few</w:t>
       </w:r>
       <w:r>
         <w:t xml:space="preserve"> </w:t>
@@ -620,7 +626,7 @@
         <w:t xml:space="preserve"> </w:t>
       </w:r>
       <w:r>
-        <w:t xml:space="preserve">account. Within its range that sovereignty was real. Beyond its range it stopped. An oral order could not</w:t>
+        <w:t xml:space="preserve">account. Within its range that sovereignty was real; beyond its range it stopped. An oral order could not</w:t>
       </w:r>
       <w:r>
         <w:t xml:space="preserve"> </w:t>
@@ -720,43 +726,37 @@
         <w:pStyle w:val="BodyText"/>
       </w:pPr>
       <w:r>
-        <w:t xml:space="preserve">Literacy was a clerical monopoly for most of its history, and the point matters more than the celebration</w:t>
-      </w:r>
-      <w:r>
-        <w:t xml:space="preserve"> </w:t>
-      </w:r>
-      <w:r>
-        <w:t xml:space="preserve">usually allows. Those who could write governed those who could not, and the reach of democratic sovereignty</w:t>
-      </w:r>
-      <w:r>
-        <w:t xml:space="preserve"> </w:t>
-      </w:r>
-      <w:r>
-        <w:t xml:space="preserve">tracked the spread of the competence rather than the invention of the medium. Media theory has long paired</w:t>
-      </w:r>
-      <w:r>
-        <w:t xml:space="preserve"> </w:t>
-      </w:r>
-      <w:r>
-        <w:t xml:space="preserve">forms of authority with the media that carry them, from Innis (1951) on how a civilization’s dominant</w:t>
-      </w:r>
-      <w:r>
-        <w:t xml:space="preserve"> </w:t>
-      </w:r>
-      <w:r>
-        <w:t xml:space="preserve">medium biases its form of power to Eisenstein (1979) on the printing press and the authority of church and</w:t>
-      </w:r>
-      <w:r>
-        <w:t xml:space="preserve"> </w:t>
-      </w:r>
-      <w:r>
-        <w:t xml:space="preserve">state. One modest claim survives every qualification of that tradition: a sovereignty and its competence</w:t>
-      </w:r>
-      <w:r>
-        <w:t xml:space="preserve"> </w:t>
-      </w:r>
-      <w:r>
-        <w:t xml:space="preserve">form together, and no sovereignty can be contested by those who lack the competence its medium requires.</w:t>
+        <w:t xml:space="preserve">Literacy was a clerical monopoly for most of its history. Those who could write governed those who</w:t>
+      </w:r>
+      <w:r>
+        <w:t xml:space="preserve"> </w:t>
+      </w:r>
+      <w:r>
+        <w:t xml:space="preserve">could not, and the reach of democratic sovereignty tracked the spread of the competence rather than the</w:t>
+      </w:r>
+      <w:r>
+        <w:t xml:space="preserve"> </w:t>
+      </w:r>
+      <w:r>
+        <w:t xml:space="preserve">invention of the medium. Media theory has long paired forms of authority with the media that carry them,</w:t>
+      </w:r>
+      <w:r>
+        <w:t xml:space="preserve"> </w:t>
+      </w:r>
+      <w:r>
+        <w:t xml:space="preserve">from Innis (1951) on how a civilization’s dominant medium biases its form of power to Eisenstein (1979) on</w:t>
+      </w:r>
+      <w:r>
+        <w:t xml:space="preserve"> </w:t>
+      </w:r>
+      <w:r>
+        <w:t xml:space="preserve">the printing press and the authority of church and state. A sovereignty and its competence form together,</w:t>
+      </w:r>
+      <w:r>
+        <w:t xml:space="preserve"> </w:t>
+      </w:r>
+      <w:r>
+        <w:t xml:space="preserve">and no sovereignty can be contested by those who lack the competence its medium requires.</w:t>
       </w:r>
     </w:p>
     <w:bookmarkEnd w:id="12"/>
@@ -792,19 +792,19 @@
         <w:t xml:space="preserve"> </w:t>
       </w:r>
       <w:r>
-        <w:t xml:space="preserve">The AI Act classifies systems and imposes documentation and transparency duties. The GDPR establishes</w:t>
-      </w:r>
-      <w:r>
-        <w:t xml:space="preserve"> </w:t>
-      </w:r>
-      <w:r>
-        <w:t xml:space="preserve">data-subject rights exercised through notice, consent, access, and record-keeping. NIS2 mandates written</w:t>
-      </w:r>
-      <w:r>
-        <w:t xml:space="preserve"> </w:t>
-      </w:r>
-      <w:r>
-        <w:t xml:space="preserve">cybersecurity governance. Each is a mechanism by which an actor with enough legal, technical, and</w:t>
+        <w:t xml:space="preserve">The AI Act classifies systems and imposes documentation and transparency duties, the GDPR establishes</w:t>
+      </w:r>
+      <w:r>
+        <w:t xml:space="preserve"> </w:t>
+      </w:r>
+      <w:r>
+        <w:t xml:space="preserve">data-subject rights exercised through notice, consent, access, and record-keeping, and NIS2 mandates</w:t>
+      </w:r>
+      <w:r>
+        <w:t xml:space="preserve"> </w:t>
+      </w:r>
+      <w:r>
+        <w:t xml:space="preserve">written cybersecurity governance. Each is a mechanism by which an actor with enough legal, technical, and</w:t>
       </w:r>
       <w:r>
         <w:t xml:space="preserve"> </w:t>
@@ -923,13 +923,7 @@
         <w:t xml:space="preserve"> </w:t>
       </w:r>
       <w:r>
-        <w:t xml:space="preserve">fails. The failure is not a shortfall of political will or a gap in drafting. It follows from what the</w:t>
-      </w:r>
-      <w:r>
-        <w:t xml:space="preserve"> </w:t>
-      </w:r>
-      <w:r>
-        <w:t xml:space="preserve">coordinated actor is enrolled in.</w:t>
+        <w:t xml:space="preserve">fails. The failure follows from what the coordinated actor is enrolled in.</w:t>
       </w:r>
     </w:p>
     <w:p>
@@ -1119,13 +1113,13 @@
         <w:t xml:space="preserve"> </w:t>
       </w:r>
       <w:r>
-        <w:t xml:space="preserve">apparatus that coordinates the parties is set by a party with a stake in the outcome. Each feature has been</w:t>
-      </w:r>
-      <w:r>
-        <w:t xml:space="preserve"> </w:t>
-      </w:r>
-      <w:r>
-        <w:t xml:space="preserve">described before. Together they defeat disclosure as a way of governing. The coordinated actor takes no</w:t>
+        <w:t xml:space="preserve">apparatus that coordinates the parties is set by a party with a stake in the outcome. None of the three is</w:t>
+      </w:r>
+      <w:r>
+        <w:t xml:space="preserve"> </w:t>
+      </w:r>
+      <w:r>
+        <w:t xml:space="preserve">new; together they defeat disclosure as a way of governing. The coordinated actor takes no</w:t>
       </w:r>
       <w:r>
         <w:t xml:space="preserve"> </w:t>
@@ -1199,13 +1193,13 @@
         <w:t xml:space="preserve"> </w:t>
       </w:r>
       <w:r>
-        <w:t xml:space="preserve">participation removed. The seller has no seat and no ceremony of consultation, only a determination. The</w:t>
-      </w:r>
-      <w:r>
-        <w:t xml:space="preserve"> </w:t>
-      </w:r>
-      <w:r>
-        <w:t xml:space="preserve">term is narrowed along Selznick’s own axis.</w:t>
+        <w:t xml:space="preserve">participation removed: the seller has no seat and no ceremony of consultation, only a determination, and</w:t>
+      </w:r>
+      <w:r>
+        <w:t xml:space="preserve"> </w:t>
+      </w:r>
+      <w:r>
+        <w:t xml:space="preserve">the term is narrowed along Selznick’s own axis.</w:t>
       </w:r>
     </w:p>
     <w:bookmarkStart w:id="15" w:name="the-mediated-triad"/>
@@ -1532,7 +1526,7 @@
         <w:t xml:space="preserve"> </w:t>
       </w:r>
       <w:r>
-        <w:t xml:space="preserve">existing models of digital sovereignty as rights-based, market-oriented, centralising, or state-based, and</w:t>
+        <w:t xml:space="preserve">existing models of digital sovereignty as rights-based, market-oriented, centralizing, or state-based, and</w:t>
       </w:r>
       <w:r>
         <w:t xml:space="preserve"> </w:t>
@@ -2928,13 +2922,13 @@
         <w:t xml:space="preserve"> </w:t>
       </w:r>
       <w:r>
-        <w:t xml:space="preserve">not produce voice. It forecloses exit and leaves voice as the residual lever, one available against</w:t>
-      </w:r>
-      <w:r>
-        <w:t xml:space="preserve"> </w:t>
-      </w:r>
-      <w:r>
-        <w:t xml:space="preserve">contingent mediators too and the only one left where the mediator is necessary. Whether a coordinated actor</w:t>
+        <w:t xml:space="preserve">not produce voice. It forecloses exit and leaves voice as the residual lever, available against a contingent gate too</w:t>
+      </w:r>
+      <w:r>
+        <w:t xml:space="preserve"> </w:t>
+      </w:r>
+      <w:r>
+        <w:t xml:space="preserve">and the only one left where the mediation is necessary. Whether a coordinated actor</w:t>
       </w:r>
       <w:r>
         <w:t xml:space="preserve"> </w:t>
@@ -3755,7 +3749,7 @@
         <w:t xml:space="preserve"> </w:t>
       </w:r>
       <w:r>
-        <w:t xml:space="preserve">occupies the position of being coordinated through a mediation it cannot leave bears coordinative</w:t>
+        <w:t xml:space="preserve">occupies the position of being coordinated through a necessary mediation bears coordinative</w:t>
       </w:r>
       <w:r>
         <w:t xml:space="preserve"> </w:t>
@@ -3785,7 +3779,7 @@
         <w:t xml:space="preserve"> </w:t>
       </w:r>
       <w:r>
-        <w:t xml:space="preserve">rest. The construct is one. The measurement differs by level, and section 9 takes that up.</w:t>
+        <w:t xml:space="preserve">rest. The construct is one; the measurement differs by level, and section 9 takes that up.</w:t>
       </w:r>
     </w:p>
     <w:p>
@@ -3885,7 +3879,7 @@
         <w:t xml:space="preserve"> </w:t>
       </w:r>
       <w:r>
-        <w:t xml:space="preserve">within an irreducible coordination outlives the question of who holds the title. E. Anderson (2017) makes</w:t>
+        <w:t xml:space="preserve">within a necessary mediation outlives the question of who holds the title. E. Anderson (2017) makes</w:t>
       </w:r>
       <w:r>
         <w:t xml:space="preserve"> </w:t>
@@ -3991,13 +3985,13 @@
         <w:pStyle w:val="FirstParagraph"/>
       </w:pPr>
       <w:r>
-        <w:t xml:space="preserve">The diagnostic sorts institutions, and the sorting produces a result that a catalog of remedies would miss:</w:t>
-      </w:r>
-      <w:r>
-        <w:t xml:space="preserve"> </w:t>
-      </w:r>
-      <w:r>
-        <w:t xml:space="preserve">the same instrument changes character depending on which kind of mediator it meets.</w:t>
+        <w:t xml:space="preserve">The diagnostic that sorted mediators now sorts those institutions: the same instrument changes character</w:t>
+      </w:r>
+      <w:r>
+        <w:t xml:space="preserve"> </w:t>
+      </w:r>
+      <w:r>
+        <w:t xml:space="preserve">depending on which kind of mediator it meets.</w:t>
       </w:r>
     </w:p>
     <w:p>
@@ -4659,7 +4653,13 @@
         <w:t xml:space="preserve"> </w:t>
       </w:r>
       <w:r>
-        <w:t xml:space="preserve">of such institutions confers, and the diagnostic is what tells a policymaker where to put each one.</w:t>
+        <w:t xml:space="preserve">of such institutions confers, and the diagnostic that places each one also splits what current research</w:t>
+      </w:r>
+      <w:r>
+        <w:t xml:space="preserve"> </w:t>
+      </w:r>
+      <w:r>
+        <w:t xml:space="preserve">treats as a single organizational capability.</w:t>
       </w:r>
     </w:p>
     <w:bookmarkEnd w:id="27"/>
@@ -4677,19 +4677,19 @@
         <w:pStyle w:val="FirstParagraph"/>
       </w:pPr>
       <w:r>
-        <w:t xml:space="preserve">Current research typically operationalizes organizational digital sovereignty as a single capability built</w:t>
-      </w:r>
-      <w:r>
-        <w:t xml:space="preserve"> </w:t>
-      </w:r>
-      <w:r>
-        <w:t xml:space="preserve">from regulatory and infrastructural components (Fratini et al., 2024; Hummel et al., 2021; Schmuntzsch et</w:t>
-      </w:r>
-      <w:r>
-        <w:t xml:space="preserve"> </w:t>
-      </w:r>
-      <w:r>
-        <w:t xml:space="preserve">al., 2025). The typology here separates two phenomena that vary independently across firms. Digital</w:t>
+        <w:t xml:space="preserve">Fratini et al. (2024), Hummel et al. (2021), and Schmuntzsch et al. (2025) operationalize organizational</w:t>
+      </w:r>
+      <w:r>
+        <w:t xml:space="preserve"> </w:t>
+      </w:r>
+      <w:r>
+        <w:t xml:space="preserve">digital sovereignty as one capability built from regulatory and infrastructural components. The typology</w:t>
+      </w:r>
+      <w:r>
+        <w:t xml:space="preserve"> </w:t>
+      </w:r>
+      <w:r>
+        <w:t xml:space="preserve">separates two phenomena that vary independently across firms. Digital</w:t>
       </w:r>
       <w:r>
         <w:t xml:space="preserve"> </w:t>
@@ -4903,13 +4903,13 @@
         <w:t xml:space="preserve"> </w:t>
       </w:r>
       <w:r>
-        <w:t xml:space="preserve">written into law. Standing over the coordination is being built while control of the infrastructure stays</w:t>
-      </w:r>
-      <w:r>
-        <w:t xml:space="preserve"> </w:t>
-      </w:r>
-      <w:r>
-        <w:t xml:space="preserve">at zero.</w:t>
+        <w:t xml:space="preserve">written into law. Member states are building that standing while control of the infrastructure stays at</w:t>
+      </w:r>
+      <w:r>
+        <w:t xml:space="preserve"> </w:t>
+      </w:r>
+      <w:r>
+        <w:t xml:space="preserve">zero.</w:t>
       </w:r>
     </w:p>
     <w:p>
@@ -4929,7 +4929,7 @@
         <w:t xml:space="preserve"> </w:t>
       </w:r>
       <w:r>
-        <w:t xml:space="preserve">compliance secures a digital position and acquires no ability to predict or contest the algorithmic</w:t>
+        <w:t xml:space="preserve">compliance secures a digital position and does not acquire standing over the algorithmic</w:t>
       </w:r>
       <w:r>
         <w:t xml:space="preserve"> </w:t>
@@ -5163,13 +5163,7 @@
         <w:pStyle w:val="FirstParagraph"/>
       </w:pPr>
       <w:r>
-        <w:t xml:space="preserve">The typology’s contribution is conceptual, and the empirical program it opens begins with measurement. Four</w:t>
-      </w:r>
-      <w:r>
-        <w:t xml:space="preserve"> </w:t>
-      </w:r>
-      <w:r>
-        <w:t xml:space="preserve">directions follow, in rough order of dependence.</w:t>
+        <w:t xml:space="preserve">The empirical program begins with measurement. Four directions follow, in rough order of dependence.</w:t>
       </w:r>
     </w:p>
     <w:p>
@@ -5251,19 +5245,31 @@
         <w:t xml:space="preserve"> </w:t>
       </w:r>
       <w:r>
-        <w:t xml:space="preserve">mediator the actor cannot readily leave. The nearest validated construct is psychological empowerment</w:t>
-      </w:r>
-      <w:r>
-        <w:t xml:space="preserve"> </w:t>
-      </w:r>
-      <w:r>
-        <w:t xml:space="preserve">(Spreitzer, 1995), and the task is to show that standing within an unexitable external mediation differs</w:t>
-      </w:r>
-      <w:r>
-        <w:t xml:space="preserve"> </w:t>
-      </w:r>
-      <w:r>
-        <w:t xml:space="preserve">from felt empowerment inside an organization one could leave. Republican theory offers a usable test item</w:t>
+        <w:t xml:space="preserve">necessary mediation, an arrangement the open tie does not dissolve. Lock-in under a contingent gate is</w:t>
+      </w:r>
+      <w:r>
+        <w:t xml:space="preserve"> </w:t>
+      </w:r>
+      <w:r>
+        <w:t xml:space="preserve">involuntary retention, and it belongs to the exit column. The nearest validated construct is psychological</w:t>
+      </w:r>
+      <w:r>
+        <w:t xml:space="preserve"> </w:t>
+      </w:r>
+      <w:r>
+        <w:t xml:space="preserve">empowerment (Spreitzer, 1995), and the task is to show that standing within a mediation the actor cannot</w:t>
+      </w:r>
+      <w:r>
+        <w:t xml:space="preserve"> </w:t>
+      </w:r>
+      <w:r>
+        <w:t xml:space="preserve">bypass differs from felt empowerment inside an organization one could leave, and differs again from</w:t>
+      </w:r>
+      <w:r>
+        <w:t xml:space="preserve"> </w:t>
+      </w:r>
+      <w:r>
+        <w:t xml:space="preserve">standing withheld by switching costs alone. Republican theory offers a usable test item</w:t>
       </w:r>
       <w:r>
         <w:t xml:space="preserve"> </w:t>
@@ -5485,13 +5491,19 @@
         <w:t xml:space="preserve"> </w:t>
       </w:r>
       <w:r>
-        <w:t xml:space="preserve">and the standing it makes possible is coordinative sovereignty: effective voice within a coordination one</w:t>
-      </w:r>
-      <w:r>
-        <w:t xml:space="preserve"> </w:t>
-      </w:r>
-      <w:r>
-        <w:t xml:space="preserve">cannot leave, carried far enough to be a share in how that coordination is governed.</w:t>
+        <w:t xml:space="preserve">and the standing it makes possible is coordinative sovereignty: effective voice within a necessary</w:t>
+      </w:r>
+      <w:r>
+        <w:t xml:space="preserve"> </w:t>
+      </w:r>
+      <w:r>
+        <w:t xml:space="preserve">mediation, an arrangement the open tie does not dissolve, carried far enough to be a share in how that</w:t>
+      </w:r>
+      <w:r>
+        <w:t xml:space="preserve"> </w:t>
+      </w:r>
+      <w:r>
+        <w:t xml:space="preserve">coordination is governed.</w:t>
       </w:r>
     </w:p>
     <w:p>
@@ -9290,13 +9302,13 @@
         <w:t xml:space="preserve"> </w:t>
       </w:r>
       <w:r>
-        <w:t xml:space="preserve">by whatever actor occupies that relation, individual or organizational. Irreducibility as a coordination is</w:t>
-      </w:r>
-      <w:r>
-        <w:t xml:space="preserve"> </w:t>
-      </w:r>
-      <w:r>
-        <w:t xml:space="preserve">currently wired does not by itself establish the condition; necessity does.</w:t>
+        <w:t xml:space="preserve">by whatever actor occupies that relation, individual or organizational. Irreducibility as the</w:t>
+      </w:r>
+      <w:r>
+        <w:t xml:space="preserve"> </w:t>
+      </w:r>
+      <w:r>
+        <w:t xml:space="preserve">coordination is currently wired does not by itself establish necessity.</w:t>
       </w:r>
     </w:p>
     <w:p>

</xml_diff>

<commit_message>
cs chapter: apply the post-cascade panel to the manuscript.
Keep the argument, tighten the opening, and land the review packet with the Word export.

Co-authored-by: Cursor <cursoragent@cursor.com>
</commit_message>
<xml_diff>
--- a/submissions/coordinative_sovereignty/chapter/Full Paper - Alg & Sov.docx
+++ b/submissions/coordinative_sovereignty/chapter/Full Paper - Alg & Sov.docx
@@ -67,13 +67,13 @@
         <w:t xml:space="preserve"> </w:t>
       </w:r>
       <w:r>
-        <w:t xml:space="preserve">contest the mediator’s arbitrary power, and to share in governing what the open tie does not dissolve.</w:t>
-      </w:r>
-      <w:r>
-        <w:t xml:space="preserve"> </w:t>
-      </w:r>
-      <w:r>
-        <w:t xml:space="preserve">A counterfactual sorts mediators an actor can leave from those it can only govern, and names the</w:t>
+        <w:t xml:space="preserve">contest the mediator’s arbitrary power, and to share in governing what the open tie does not dissolve. A</w:t>
+      </w:r>
+      <w:r>
+        <w:t xml:space="preserve"> </w:t>
+      </w:r>
+      <w:r>
+        <w:t xml:space="preserve">counterfactual sorts mediators an actor can leave from those it can only govern, and names the</w:t>
       </w:r>
       <w:r>
         <w:t xml:space="preserve"> </w:t>
@@ -213,21 +213,15 @@
         <w:t xml:space="preserve"> </w:t>
       </w:r>
       <w:r>
-        <w:t xml:space="preserve">to bury</w:t>
-      </w:r>
-      <w:r>
-        <w:t xml:space="preserve"> </w:t>
-      </w:r>
-      <w:r>
-        <w:t xml:space="preserve">(Cutolo &amp; Kenney, 2021; Rahman, 2021; Rahman et al., 2024).</w:t>
-      </w:r>
-    </w:p>
-    <w:p>
-      <w:pPr>
-        <w:pStyle w:val="BodyText"/>
-      </w:pPr>
-      <w:r>
-        <w:t xml:space="preserve">Behind the gap lies a pattern older than the platforms. Every form of sovereignty has required a competence</w:t>
+        <w:t xml:space="preserve">to bury (Cutolo &amp; Kenney, 2021; Rahman, 2021; Rahman et al., 2024).</w:t>
+      </w:r>
+    </w:p>
+    <w:p>
+      <w:pPr>
+        <w:pStyle w:val="BodyText"/>
+      </w:pPr>
+      <w:r>
+        <w:t xml:space="preserve">Behind the gap lies a pattern older than the platforms: every form of sovereignty has required a competence</w:t>
       </w:r>
       <w:r>
         <w:t xml:space="preserve"> </w:t>
@@ -251,7 +245,7 @@
         <w:t xml:space="preserve"> </w:t>
       </w:r>
       <w:r>
-        <w:t xml:space="preserve">was a practised skill before it was a political fact. Digital sovereignty extends that logic to new</w:t>
+        <w:t xml:space="preserve">was a practiced skill before it was a political fact. Digital sovereignty extends that logic to new</w:t>
       </w:r>
       <w:r>
         <w:t xml:space="preserve"> </w:t>
@@ -295,19 +289,19 @@
         <w:t xml:space="preserve"> </w:t>
       </w:r>
       <w:r>
-        <w:t xml:space="preserve">it, and what sets the situation apart is a question about the coordination’s rules. Restore the</w:t>
-      </w:r>
-      <w:r>
-        <w:t xml:space="preserve"> </w:t>
-      </w:r>
-      <w:r>
-        <w:t xml:space="preserve">direct tie between the two parties the mediator stands between, the tie that strict mediation forbids, and</w:t>
-      </w:r>
-      <w:r>
-        <w:t xml:space="preserve"> </w:t>
-      </w:r>
-      <w:r>
-        <w:t xml:space="preserve">ask what the mediator still does. Some mediators lose their grip entirely. Others lose nothing. That single</w:t>
+        <w:t xml:space="preserve">it, and what sets the situation apart is a question about the coordination’s rules. Restore the direct tie</w:t>
+      </w:r>
+      <w:r>
+        <w:t xml:space="preserve"> </w:t>
+      </w:r>
+      <w:r>
+        <w:t xml:space="preserve">between the two parties the mediator stands between, the tie that strict mediation forbids, and ask what</w:t>
+      </w:r>
+      <w:r>
+        <w:t xml:space="preserve"> </w:t>
+      </w:r>
+      <w:r>
+        <w:t xml:space="preserve">the mediator still does. Some mediators lose their grip entirely. Others lose nothing. That single</w:t>
       </w:r>
       <w:r>
         <w:t xml:space="preserve"> </w:t>
@@ -371,31 +365,31 @@
         <w:pStyle w:val="BodyText"/>
       </w:pPr>
       <w:r>
-        <w:t xml:space="preserve">The alternative is coordinative sovereignty: standing within a necessary mediation, the power to</w:t>
-      </w:r>
-      <w:r>
-        <w:t xml:space="preserve"> </w:t>
-      </w:r>
-      <w:r>
-        <w:t xml:space="preserve">shape the terms on which one is mediated, to contest the mediator’s arbitrary power, and to hold a share in</w:t>
-      </w:r>
-      <w:r>
-        <w:t xml:space="preserve"> </w:t>
-      </w:r>
-      <w:r>
-        <w:t xml:space="preserve">the governance of an arrangement the open tie does not dissolve. Where digital sovereignty asks who</w:t>
-      </w:r>
-      <w:r>
-        <w:t xml:space="preserve"> </w:t>
-      </w:r>
-      <w:r>
-        <w:t xml:space="preserve">controls the infrastructure, coordinative sovereignty asks what autonomy remains for the actor coordinating</w:t>
-      </w:r>
-      <w:r>
-        <w:t xml:space="preserve"> </w:t>
-      </w:r>
-      <w:r>
-        <w:t xml:space="preserve">through it. The two vary independently, and the rest of the chapter tells them apart.</w:t>
+        <w:t xml:space="preserve">The alternative is coordinative sovereignty: standing within a necessary mediation, the power to shape the</w:t>
+      </w:r>
+      <w:r>
+        <w:t xml:space="preserve"> </w:t>
+      </w:r>
+      <w:r>
+        <w:t xml:space="preserve">terms on which one is mediated, to contest the mediator’s arbitrary power, and to hold a share in the</w:t>
+      </w:r>
+      <w:r>
+        <w:t xml:space="preserve"> </w:t>
+      </w:r>
+      <w:r>
+        <w:t xml:space="preserve">governance of an arrangement the open tie does not dissolve. Where digital sovereignty asks who controls</w:t>
+      </w:r>
+      <w:r>
+        <w:t xml:space="preserve"> </w:t>
+      </w:r>
+      <w:r>
+        <w:t xml:space="preserve">the infrastructure, coordinative sovereignty asks what autonomy remains for the actor coordinating through</w:t>
+      </w:r>
+      <w:r>
+        <w:t xml:space="preserve"> </w:t>
+      </w:r>
+      <w:r>
+        <w:t xml:space="preserve">it. The two vary independently.</w:t>
       </w:r>
     </w:p>
     <w:p>
@@ -457,31 +451,31 @@
         <w:t xml:space="preserve"> </w:t>
       </w:r>
       <w:r>
-        <w:t xml:space="preserve">necessary mediation and a standing carried by voice, and so narrows the term’s extension.</w:t>
-      </w:r>
-      <w:r>
-        <w:t xml:space="preserve"> </w:t>
-      </w:r>
-      <w:r>
-        <w:t xml:space="preserve">Repetto (2025), reviewing 240 works on digital sovereignty, reaches the same conclusion about the family:</w:t>
-      </w:r>
-      <w:r>
-        <w:t xml:space="preserve"> </w:t>
-      </w:r>
-      <w:r>
-        <w:t xml:space="preserve">accounts that recognize multiple coexisting digital sovereigns</w:t>
-      </w:r>
-      <w:r>
-        <w:t xml:space="preserve"> </w:t>
-      </w:r>
-      <w:r>
-        <w:t xml:space="preserve">“neither stretch the concept of sovereignty</w:t>
-      </w:r>
-      <w:r>
-        <w:t xml:space="preserve"> </w:t>
-      </w:r>
-      <w:r>
-        <w:t xml:space="preserve">nor turn digital sovereignty into something different from sovereignty tout court,”</w:t>
+        <w:t xml:space="preserve">necessary mediation and a standing carried by voice, and so narrows the term’s extension. Repetto (2025),</w:t>
+      </w:r>
+      <w:r>
+        <w:t xml:space="preserve"> </w:t>
+      </w:r>
+      <w:r>
+        <w:t xml:space="preserve">reviewing 240 works on digital sovereignty, reaches the same conclusion about the family: accounts that</w:t>
+      </w:r>
+      <w:r>
+        <w:t xml:space="preserve"> </w:t>
+      </w:r>
+      <w:r>
+        <w:t xml:space="preserve">recognize multiple coexisting digital sovereigns</w:t>
+      </w:r>
+      <w:r>
+        <w:t xml:space="preserve"> </w:t>
+      </w:r>
+      <w:r>
+        <w:t xml:space="preserve">“neither stretch the concept of sovereignty nor turn</w:t>
+      </w:r>
+      <w:r>
+        <w:t xml:space="preserve"> </w:t>
+      </w:r>
+      <w:r>
+        <w:t xml:space="preserve">digital sovereignty into something different from sovereignty tout court,”</w:t>
       </w:r>
       <w:r>
         <w:t xml:space="preserve"> </w:t>
@@ -493,13 +487,13 @@
         <w:t xml:space="preserve"> </w:t>
       </w:r>
       <w:r>
-        <w:t xml:space="preserve">“explore ways to</w:t>
-      </w:r>
-      <w:r>
-        <w:t xml:space="preserve"> </w:t>
-      </w:r>
-      <w:r>
-        <w:t xml:space="preserve">innovate the concept of sovereignty as a whole”</w:t>
+        <w:t xml:space="preserve">“explore ways to innovate</w:t>
+      </w:r>
+      <w:r>
+        <w:t xml:space="preserve"> </w:t>
+      </w:r>
+      <w:r>
+        <w:t xml:space="preserve">the concept of sovereignty as a whole”</w:t>
       </w:r>
       <w:r>
         <w:t xml:space="preserve"> </w:t>
@@ -572,7 +566,7 @@
         <w:pStyle w:val="FirstParagraph"/>
       </w:pPr>
       <w:r>
-        <w:t xml:space="preserve">Before writing, speech and memory carried authority. Law was what the elders could recite. An oath bound</w:t>
+        <w:t xml:space="preserve">Before writing, speech and memory carried authority: law was what the elders could recite. An oath bound</w:t>
       </w:r>
       <w:r>
         <w:t xml:space="preserve"> </w:t>
@@ -656,7 +650,7 @@
         <w:pStyle w:val="FirstParagraph"/>
       </w:pPr>
       <w:r>
-        <w:t xml:space="preserve">Writing changed the terms. A written rule persists while memory drifts, travels without its author, and can</w:t>
+        <w:t xml:space="preserve">Writing changed the terms: a written rule persists while memory drifts, travels without its author, and can</w:t>
       </w:r>
       <w:r>
         <w:t xml:space="preserve"> </w:t>
@@ -726,37 +720,37 @@
         <w:pStyle w:val="BodyText"/>
       </w:pPr>
       <w:r>
-        <w:t xml:space="preserve">Literacy was a clerical monopoly for most of its history. Those who could write governed those who</w:t>
-      </w:r>
-      <w:r>
-        <w:t xml:space="preserve"> </w:t>
-      </w:r>
-      <w:r>
-        <w:t xml:space="preserve">could not, and the reach of democratic sovereignty tracked the spread of the competence rather than the</w:t>
-      </w:r>
-      <w:r>
-        <w:t xml:space="preserve"> </w:t>
-      </w:r>
-      <w:r>
-        <w:t xml:space="preserve">invention of the medium. Media theory has long paired forms of authority with the media that carry them,</w:t>
-      </w:r>
-      <w:r>
-        <w:t xml:space="preserve"> </w:t>
-      </w:r>
-      <w:r>
-        <w:t xml:space="preserve">from Innis (1951) on how a civilization’s dominant medium biases its form of power to Eisenstein (1979) on</w:t>
-      </w:r>
-      <w:r>
-        <w:t xml:space="preserve"> </w:t>
-      </w:r>
-      <w:r>
-        <w:t xml:space="preserve">the printing press and the authority of church and state. A sovereignty and its competence form together,</w:t>
-      </w:r>
-      <w:r>
-        <w:t xml:space="preserve"> </w:t>
-      </w:r>
-      <w:r>
-        <w:t xml:space="preserve">and no sovereignty can be contested by those who lack the competence its medium requires.</w:t>
+        <w:t xml:space="preserve">Literacy was a clerical monopoly for most of its history. Those who could write governed those who could</w:t>
+      </w:r>
+      <w:r>
+        <w:t xml:space="preserve"> </w:t>
+      </w:r>
+      <w:r>
+        <w:t xml:space="preserve">not, and the reach of democratic sovereignty tracked the spread of the competence rather than the invention</w:t>
+      </w:r>
+      <w:r>
+        <w:t xml:space="preserve"> </w:t>
+      </w:r>
+      <w:r>
+        <w:t xml:space="preserve">of the medium. Media theory has long paired forms of authority with the media that carry them, from Innis</w:t>
+      </w:r>
+      <w:r>
+        <w:t xml:space="preserve"> </w:t>
+      </w:r>
+      <w:r>
+        <w:t xml:space="preserve">(1951) on how a civilization’s dominant medium biases its form of power to Eisenstein (1979) on the</w:t>
+      </w:r>
+      <w:r>
+        <w:t xml:space="preserve"> </w:t>
+      </w:r>
+      <w:r>
+        <w:t xml:space="preserve">printing press and the authority of church and state. A sovereignty and its competence form together, and</w:t>
+      </w:r>
+      <w:r>
+        <w:t xml:space="preserve"> </w:t>
+      </w:r>
+      <w:r>
+        <w:t xml:space="preserve">no sovereignty can be contested by those who lack the competence its medium requires.</w:t>
       </w:r>
     </w:p>
     <w:bookmarkEnd w:id="12"/>
@@ -834,13 +828,13 @@
         <w:t xml:space="preserve"> </w:t>
       </w:r>
       <w:r>
-        <w:t xml:space="preserve">literacy frame reaches it only partly. What follows engages the regulatory strand, where the continuity</w:t>
-      </w:r>
-      <w:r>
-        <w:t xml:space="preserve"> </w:t>
-      </w:r>
-      <w:r>
-        <w:t xml:space="preserve">with literacy is tightest.</w:t>
+        <w:t xml:space="preserve">literacy frame reaches it only partly. The regulatory strand is where the continuity with literacy is</w:t>
+      </w:r>
+      <w:r>
+        <w:t xml:space="preserve"> </w:t>
+      </w:r>
+      <w:r>
+        <w:t xml:space="preserve">tightest.</w:t>
       </w:r>
     </w:p>
     <w:p>
@@ -923,7 +917,7 @@
         <w:t xml:space="preserve"> </w:t>
       </w:r>
       <w:r>
-        <w:t xml:space="preserve">fails. The failure follows from what the coordinated actor is enrolled in.</w:t>
+        <w:t xml:space="preserve">fails, because of what the coordinated actor is enrolled in.</w:t>
       </w:r>
     </w:p>
     <w:p>
@@ -1051,7 +1045,7 @@
         <w:t xml:space="preserve"> </w:t>
       </w:r>
       <w:r>
-        <w:t xml:space="preserve">old too. A third party standing between two others who never deal directly has been the broker’s, the</w:t>
+        <w:t xml:space="preserve">old too: a third party standing between two others who never deal directly has been the broker’s, the</w:t>
       </w:r>
       <w:r>
         <w:t xml:space="preserve"> </w:t>
@@ -1095,13 +1089,13 @@
         <w:t xml:space="preserve"> </w:t>
       </w:r>
       <w:r>
-        <w:t xml:space="preserve">high-dimensional systems produce its determinations and those determinations resist interpretation. It is</w:t>
-      </w:r>
-      <w:r>
-        <w:t xml:space="preserve"> </w:t>
-      </w:r>
-      <w:r>
-        <w:t xml:space="preserve">adaptive, reconfigured continuously and without notice. And the interest it carries is not the algorithm’s</w:t>
+        <w:t xml:space="preserve">high-dimensional systems produce its determinations and those determinations resist interpretation; it is</w:t>
+      </w:r>
+      <w:r>
+        <w:t xml:space="preserve"> </w:t>
+      </w:r>
+      <w:r>
+        <w:t xml:space="preserve">adaptive, reconfigured continuously and without notice; and the interest it carries is not the algorithm’s</w:t>
       </w:r>
       <w:r>
         <w:t xml:space="preserve"> </w:t>
@@ -1119,25 +1113,25 @@
         <w:t xml:space="preserve"> </w:t>
       </w:r>
       <w:r>
-        <w:t xml:space="preserve">new; together they defeat disclosure as a way of governing. The coordinated actor takes no</w:t>
-      </w:r>
-      <w:r>
-        <w:t xml:space="preserve"> </w:t>
-      </w:r>
-      <w:r>
-        <w:t xml:space="preserve">orders from a manager and signs no negotiated deal. The platform draws it into a system that assigns,</w:t>
-      </w:r>
-      <w:r>
-        <w:t xml:space="preserve"> </w:t>
-      </w:r>
-      <w:r>
-        <w:t xml:space="preserve">ranks, prices, and recommends, whose rules it cannot see and whose objectives it does not share, and the</w:t>
-      </w:r>
-      <w:r>
-        <w:t xml:space="preserve"> </w:t>
-      </w:r>
-      <w:r>
-        <w:t xml:space="preserve">system’s ordinary operation produces its compliance.</w:t>
+        <w:t xml:space="preserve">new; together they defeat disclosure as a way of governing. The coordinated actor takes no orders from a</w:t>
+      </w:r>
+      <w:r>
+        <w:t xml:space="preserve"> </w:t>
+      </w:r>
+      <w:r>
+        <w:t xml:space="preserve">manager and signs no negotiated deal. The platform draws it into a system that assigns, ranks, prices, and</w:t>
+      </w:r>
+      <w:r>
+        <w:t xml:space="preserve"> </w:t>
+      </w:r>
+      <w:r>
+        <w:t xml:space="preserve">recommends, whose rules it cannot see and whose objectives it does not share, and the system’s ordinary</w:t>
+      </w:r>
+      <w:r>
+        <w:t xml:space="preserve"> </w:t>
+      </w:r>
+      <w:r>
+        <w:t xml:space="preserve">operation produces its compliance.</w:t>
       </w:r>
     </w:p>
     <w:p>
@@ -1234,7 +1228,7 @@
         <w:t xml:space="preserve"> </w:t>
       </w:r>
       <w:r>
-        <w:t xml:space="preserve">The rider is in the same position from the other side. The system stands between them and pursues</w:t>
+        <w:t xml:space="preserve">The rider is in the same position from the other side: the system stands between them and pursues</w:t>
       </w:r>
       <w:r>
         <w:t xml:space="preserve"> </w:t>
@@ -1288,7 +1282,7 @@
         <w:t xml:space="preserve"> </w:t>
       </w:r>
       <w:r>
-        <w:t xml:space="preserve">determinations do not merely influence the coordination. They constitute it.</w:t>
+        <w:t xml:space="preserve">determinations constitute the coordination.</w:t>
       </w:r>
     </w:p>
     <w:bookmarkEnd w:id="15"/>
@@ -1320,195 +1314,201 @@
         <w:pStyle w:val="BodyText"/>
       </w:pPr>
       <w:r>
-        <w:t xml:space="preserve">First, the object resists reading. Burrell (2016) distinguishes three opacities: the intentional kind, the</w:t>
-      </w:r>
-      <w:r>
-        <w:t xml:space="preserve"> </w:t>
-      </w:r>
-      <w:r>
-        <w:t xml:space="preserve">kind that follows from technical illiteracy, and the kind intrinsic to the scale and mathematics of machine</w:t>
-      </w:r>
-      <w:r>
-        <w:t xml:space="preserve"> </w:t>
-      </w:r>
-      <w:r>
-        <w:t xml:space="preserve">learning. The third survives the release of source code. The behavior of a model over millions of</w:t>
-      </w:r>
-      <w:r>
-        <w:t xml:space="preserve"> </w:t>
-      </w:r>
-      <w:r>
-        <w:t xml:space="preserve">parameters and cases is not legible the way a statute is legible, and one can read the code and still not</w:t>
-      </w:r>
-      <w:r>
-        <w:t xml:space="preserve"> </w:t>
-      </w:r>
-      <w:r>
-        <w:t xml:space="preserve">know what the system will do.</w:t>
-      </w:r>
-    </w:p>
-    <w:p>
-      <w:pPr>
-        <w:pStyle w:val="BodyText"/>
-      </w:pPr>
-      <w:r>
-        <w:t xml:space="preserve">Second, the object moves. A statute holds still long enough to be read, compared, and contested. A ranking</w:t>
-      </w:r>
-      <w:r>
-        <w:t xml:space="preserve"> </w:t>
-      </w:r>
-      <w:r>
-        <w:t xml:space="preserve">system is retuned continuously, so a disclosure describes a configuration that may not survive the quarter.</w:t>
-      </w:r>
-      <w:r>
-        <w:t xml:space="preserve"> </w:t>
-      </w:r>
-      <w:r>
-        <w:t xml:space="preserve">Adaptivity defeats disclosure more decisively than opacity does, because it defeats even a complete</w:t>
-      </w:r>
-      <w:r>
-        <w:t xml:space="preserve"> </w:t>
-      </w:r>
-      <w:r>
-        <w:t xml:space="preserve">disclosure.</w:t>
-      </w:r>
-    </w:p>
-    <w:p>
-      <w:pPr>
-        <w:pStyle w:val="BodyText"/>
-      </w:pPr>
-      <w:r>
-        <w:t xml:space="preserve">Third, reading without a channel to act produces no accountability. Ananny and Crawford (2018) show that</w:t>
-      </w:r>
-      <w:r>
-        <w:t xml:space="preserve"> </w:t>
-      </w:r>
-      <w:r>
-        <w:t xml:space="preserve">the transparency ideal fails when no institution can act on what is seen. A disclosure that no party has</w:t>
-      </w:r>
-      <w:r>
-        <w:t xml:space="preserve"> </w:t>
-      </w:r>
-      <w:r>
-        <w:t xml:space="preserve">standing to contest is a fact without a consequence.</w:t>
-      </w:r>
-    </w:p>
-    <w:p>
-      <w:pPr>
-        <w:pStyle w:val="BodyText"/>
-      </w:pPr>
-      <w:r>
-        <w:t xml:space="preserve">Fourth, the actors who most need to contest the system have no leverage over it. Platform-dependent</w:t>
-      </w:r>
-      <w:r>
-        <w:t xml:space="preserve"> </w:t>
-      </w:r>
-      <w:r>
-        <w:t xml:space="preserve">entrepreneurs operate under power asymmetries that diversification cannot relieve, because in many sectors</w:t>
-      </w:r>
-      <w:r>
-        <w:t xml:space="preserve"> </w:t>
-      </w:r>
-      <w:r>
-        <w:t xml:space="preserve">no alternative platform exists at the required scale (Cutolo &amp; Kenney, 2021). Workers under opaque</w:t>
-      </w:r>
-      <w:r>
-        <w:t xml:space="preserve"> </w:t>
-      </w:r>
-      <w:r>
-        <w:t xml:space="preserve">algorithmic evaluation inhabit what Rahman (2021) calls an invisible cage: they react to a system whose</w:t>
-      </w:r>
-      <w:r>
-        <w:t xml:space="preserve"> </w:t>
-      </w:r>
-      <w:r>
-        <w:t xml:space="preserve">rules they cannot see, adjusting their behavior to a shifting target, and the reaction is itself a form of</w:t>
-      </w:r>
-      <w:r>
-        <w:t xml:space="preserve"> </w:t>
-      </w:r>
-      <w:r>
-        <w:t xml:space="preserve">control. The flexibility such platforms advertise is real, and it operates inside that control. A worker</w:t>
-      </w:r>
-      <w:r>
-        <w:t xml:space="preserve"> </w:t>
-      </w:r>
-      <w:r>
-        <w:t xml:space="preserve">chooses her hours and cannot see what her choices are measured against (Wood et al., 2019).</w:t>
-      </w:r>
-    </w:p>
-    <w:p>
-      <w:pPr>
-        <w:pStyle w:val="BodyText"/>
-      </w:pPr>
-      <w:r>
-        <w:t xml:space="preserve">Fifth, the dominant regulatory modality is disclosure, and disclosure is a literate instrument. Hildebrandt</w:t>
-      </w:r>
-      <w:r>
-        <w:t xml:space="preserve"> </w:t>
-      </w:r>
-      <w:r>
-        <w:t xml:space="preserve">(2015) distinguishes the mode of law that operates through written rules from the modes that operate</w:t>
-      </w:r>
-      <w:r>
-        <w:t xml:space="preserve"> </w:t>
-      </w:r>
-      <w:r>
-        <w:t xml:space="preserve">through code and data, and argues that the first cannot straightforwardly govern the second. Recent</w:t>
-      </w:r>
-      <w:r>
-        <w:t xml:space="preserve"> </w:t>
-      </w:r>
-      <w:r>
-        <w:t xml:space="preserve">European instruments do reach into ranking and automated decisions: the Platform-to-Business Regulation</w:t>
-      </w:r>
-      <w:r>
-        <w:t xml:space="preserve"> </w:t>
-      </w:r>
-      <w:r>
-        <w:t xml:space="preserve">obliges platforms to disclose the main parameters of ranking, the Digital Services Act adds recommender</w:t>
-      </w:r>
-      <w:r>
-        <w:t xml:space="preserve"> </w:t>
-      </w:r>
-      <w:r>
-        <w:t xml:space="preserve">transparency and researcher access, and the Digital Markets Act constrains gatekeeper conduct. What these</w:t>
-      </w:r>
-      <w:r>
-        <w:t xml:space="preserve"> </w:t>
-      </w:r>
-      <w:r>
-        <w:t xml:space="preserve">share is the literate wager, that a legible object placed before an actor who can act on it will hold its</w:t>
-      </w:r>
-      <w:r>
-        <w:t xml:space="preserve"> </w:t>
-      </w:r>
-      <w:r>
-        <w:t xml:space="preserve">operator to account. Article 22 of the GDPR belongs to a different family: it gives a natural person</w:t>
-      </w:r>
-      <w:r>
-        <w:t xml:space="preserve"> </w:t>
-      </w:r>
-      <w:r>
-        <w:t xml:space="preserve">subject to a solely automated decision the right to obtain human intervention and to contest the outcome.</w:t>
-      </w:r>
-      <w:r>
-        <w:t xml:space="preserve"> </w:t>
-      </w:r>
-      <w:r>
-        <w:t xml:space="preserve">That is case-level standing already in hard law, and section 7 places it among the voice instruments. Its</w:t>
-      </w:r>
-      <w:r>
-        <w:t xml:space="preserve"> </w:t>
-      </w:r>
-      <w:r>
-        <w:t xml:space="preserve">threshold is high, its practice thin, and its protection stops at the natural person, so the</w:t>
-      </w:r>
-      <w:r>
-        <w:t xml:space="preserve"> </w:t>
-      </w:r>
-      <w:r>
-        <w:t xml:space="preserve">platform-dependent firm falls outside it. Against an opaque and adaptive coordination the wager mostly</w:t>
+        <w:t xml:space="preserve">The first feature, opacity, means the object resists reading. Burrell (2016) distinguishes three opacities:</w:t>
+      </w:r>
+      <w:r>
+        <w:t xml:space="preserve"> </w:t>
+      </w:r>
+      <w:r>
+        <w:t xml:space="preserve">the intentional kind, the kind that follows from technical illiteracy, and the kind intrinsic to the scale</w:t>
+      </w:r>
+      <w:r>
+        <w:t xml:space="preserve"> </w:t>
+      </w:r>
+      <w:r>
+        <w:t xml:space="preserve">and mathematics of machine learning. The third survives the release of source code. The behavior of a model</w:t>
+      </w:r>
+      <w:r>
+        <w:t xml:space="preserve"> </w:t>
+      </w:r>
+      <w:r>
+        <w:t xml:space="preserve">over millions of parameters and cases is not legible the way a statute is legible, and one can read the</w:t>
+      </w:r>
+      <w:r>
+        <w:t xml:space="preserve"> </w:t>
+      </w:r>
+      <w:r>
+        <w:t xml:space="preserve">code and still not know what the system will do.</w:t>
+      </w:r>
+    </w:p>
+    <w:p>
+      <w:pPr>
+        <w:pStyle w:val="BodyText"/>
+      </w:pPr>
+      <w:r>
+        <w:t xml:space="preserve">The second feature, adaptivity, means the object moves. A statute holds still long enough to be read,</w:t>
+      </w:r>
+      <w:r>
+        <w:t xml:space="preserve"> </w:t>
+      </w:r>
+      <w:r>
+        <w:t xml:space="preserve">compared, and contested. A ranking system is retuned continuously, so a disclosure describes a</w:t>
+      </w:r>
+      <w:r>
+        <w:t xml:space="preserve"> </w:t>
+      </w:r>
+      <w:r>
+        <w:t xml:space="preserve">configuration that may not survive the quarter. Adaptivity defeats disclosure more decisively than opacity</w:t>
+      </w:r>
+      <w:r>
+        <w:t xml:space="preserve"> </w:t>
+      </w:r>
+      <w:r>
+        <w:t xml:space="preserve">does, because it defeats even a complete disclosure.</w:t>
+      </w:r>
+    </w:p>
+    <w:p>
+      <w:pPr>
+        <w:pStyle w:val="BodyText"/>
+      </w:pPr>
+      <w:r>
+        <w:t xml:space="preserve">The third feature is that reading without a channel to act produces no accountability. Ananny and Crawford</w:t>
+      </w:r>
+      <w:r>
+        <w:t xml:space="preserve"> </w:t>
+      </w:r>
+      <w:r>
+        <w:t xml:space="preserve">(2018) show that the transparency ideal fails when no institution can act on what is seen. A disclosure</w:t>
+      </w:r>
+      <w:r>
+        <w:t xml:space="preserve"> </w:t>
+      </w:r>
+      <w:r>
+        <w:t xml:space="preserve">that no party has standing to contest is a fact without a consequence.</w:t>
+      </w:r>
+    </w:p>
+    <w:p>
+      <w:pPr>
+        <w:pStyle w:val="BodyText"/>
+      </w:pPr>
+      <w:r>
+        <w:t xml:space="preserve">The fourth feature is that the actors who most need to contest the system have no leverage over it.</w:t>
+      </w:r>
+      <w:r>
+        <w:t xml:space="preserve"> </w:t>
+      </w:r>
+      <w:r>
+        <w:t xml:space="preserve">Platform-dependent entrepreneurs operate under power asymmetries that diversification cannot relieve,</w:t>
+      </w:r>
+      <w:r>
+        <w:t xml:space="preserve"> </w:t>
+      </w:r>
+      <w:r>
+        <w:t xml:space="preserve">because in many sectors no alternative platform exists at the required scale (Cutolo &amp; Kenney, 2021).</w:t>
+      </w:r>
+      <w:r>
+        <w:t xml:space="preserve"> </w:t>
+      </w:r>
+      <w:r>
+        <w:t xml:space="preserve">Workers under opaque algorithmic evaluation inhabit what Rahman (2021) calls an invisible cage: they react</w:t>
+      </w:r>
+      <w:r>
+        <w:t xml:space="preserve"> </w:t>
+      </w:r>
+      <w:r>
+        <w:t xml:space="preserve">to a system whose rules they cannot see, adjusting their behavior to a shifting target, and the reaction is</w:t>
+      </w:r>
+      <w:r>
+        <w:t xml:space="preserve"> </w:t>
+      </w:r>
+      <w:r>
+        <w:t xml:space="preserve">itself a form of control. The flexibility such platforms advertise is real, and it operates inside that</w:t>
+      </w:r>
+      <w:r>
+        <w:t xml:space="preserve"> </w:t>
+      </w:r>
+      <w:r>
+        <w:t xml:space="preserve">control. A worker chooses her hours and cannot see what her choices are measured against (Wood et al.,</w:t>
+      </w:r>
+      <w:r>
+        <w:t xml:space="preserve"> </w:t>
+      </w:r>
+      <w:r>
+        <w:t xml:space="preserve">2019).</w:t>
+      </w:r>
+    </w:p>
+    <w:p>
+      <w:pPr>
+        <w:pStyle w:val="BodyText"/>
+      </w:pPr>
+      <w:r>
+        <w:t xml:space="preserve">The fifth feature is that the dominant regulatory modality is disclosure, and disclosure is a literate</w:t>
+      </w:r>
+      <w:r>
+        <w:t xml:space="preserve"> </w:t>
+      </w:r>
+      <w:r>
+        <w:t xml:space="preserve">instrument. Hildebrandt (2015) distinguishes the mode of law that operates through written rules from the</w:t>
+      </w:r>
+      <w:r>
+        <w:t xml:space="preserve"> </w:t>
+      </w:r>
+      <w:r>
+        <w:t xml:space="preserve">modes that operate through code and data, and argues that the first cannot straightforwardly govern the</w:t>
+      </w:r>
+      <w:r>
+        <w:t xml:space="preserve"> </w:t>
+      </w:r>
+      <w:r>
+        <w:t xml:space="preserve">second. Recent European instruments do reach into ranking and automated decisions: the Platform-to-Business</w:t>
+      </w:r>
+      <w:r>
+        <w:t xml:space="preserve"> </w:t>
+      </w:r>
+      <w:r>
+        <w:t xml:space="preserve">Regulation obliges platforms to disclose the main parameters of ranking, the Digital Services Act adds</w:t>
+      </w:r>
+      <w:r>
+        <w:t xml:space="preserve"> </w:t>
+      </w:r>
+      <w:r>
+        <w:t xml:space="preserve">recommender transparency and researcher access, and the Digital Markets Act constrains gatekeeper conduct.</w:t>
+      </w:r>
+      <w:r>
+        <w:t xml:space="preserve"> </w:t>
+      </w:r>
+      <w:r>
+        <w:t xml:space="preserve">What these share is the literate wager, that a legible object placed before an actor who can act on it will</w:t>
+      </w:r>
+      <w:r>
+        <w:t xml:space="preserve"> </w:t>
+      </w:r>
+      <w:r>
+        <w:t xml:space="preserve">hold its operator to account. Article 22 of the GDPR belongs to a different family: it gives a natural</w:t>
+      </w:r>
+      <w:r>
+        <w:t xml:space="preserve"> </w:t>
+      </w:r>
+      <w:r>
+        <w:t xml:space="preserve">person subject to a solely automated decision the right to obtain human intervention and to contest the</w:t>
+      </w:r>
+      <w:r>
+        <w:t xml:space="preserve"> </w:t>
+      </w:r>
+      <w:r>
+        <w:t xml:space="preserve">outcome. That is case-level standing already in hard law, and section 7 places it among the voice</w:t>
+      </w:r>
+      <w:r>
+        <w:t xml:space="preserve"> </w:t>
+      </w:r>
+      <w:r>
+        <w:t xml:space="preserve">instruments. Its threshold is high, its practice thin, and its protection stops at the natural person, so</w:t>
+      </w:r>
+      <w:r>
+        <w:t xml:space="preserve"> </w:t>
+      </w:r>
+      <w:r>
+        <w:t xml:space="preserve">the platform-dependent firm falls outside it. Against an opaque and adaptive coordination the wager mostly</w:t>
       </w:r>
       <w:r>
         <w:t xml:space="preserve"> </w:t>
@@ -1546,7 +1546,7 @@
         <w:pStyle w:val="BodyText"/>
       </w:pPr>
       <w:r>
-        <w:t xml:space="preserve">Disclosure makes an object legible. What the coordinated actor needs is standing.</w:t>
+        <w:t xml:space="preserve">Disclosure makes an object legible; what the coordinated actor needs is standing.</w:t>
       </w:r>
     </w:p>
     <w:bookmarkEnd w:id="16"/>
@@ -1614,7 +1614,7 @@
         <w:t xml:space="preserve"> </w:t>
       </w:r>
       <w:r>
-        <w:t xml:space="preserve">The single-homing side is competed for and often subsidized. Application stores show the pattern. Consumers</w:t>
+        <w:t xml:space="preserve">Platforms compete for the single-homing side and often subsidize it, as application stores show. Consumers</w:t>
       </w:r>
       <w:r>
         <w:t xml:space="preserve"> </w:t>
@@ -1672,91 +1672,85 @@
         <w:pStyle w:val="BodyText"/>
       </w:pPr>
       <w:r>
-        <w:t xml:space="preserve">Opacity is not merely a by-product of this arrangement. It preserves the rent. O’Reilly et al. (2024) argue</w:t>
-      </w:r>
-      <w:r>
-        <w:t xml:space="preserve"> </w:t>
-      </w:r>
-      <w:r>
-        <w:t xml:space="preserve">that platforms extract rents through algorithmic control over the allocation of attention, that the market</w:t>
-      </w:r>
-      <w:r>
-        <w:t xml:space="preserve"> </w:t>
-      </w:r>
-      <w:r>
-        <w:t xml:space="preserve">for that allocation is opaque, and that the rents follow from discretion over allocation rather than from</w:t>
-      </w:r>
-      <w:r>
-        <w:t xml:space="preserve"> </w:t>
-      </w:r>
-      <w:r>
-        <w:t xml:space="preserve">any service rendered. Cohen (2017) documents the strategy in operation: platforms treat algorithmic logics</w:t>
-      </w:r>
-      <w:r>
-        <w:t xml:space="preserve"> </w:t>
-      </w:r>
-      <w:r>
-        <w:t xml:space="preserve">as zones of exclusivity,</w:t>
-      </w:r>
-      <w:r>
-        <w:t xml:space="preserve"> </w:t>
-      </w:r>
-      <w:r>
-        <w:t xml:space="preserve">“extracting transparency from users but shielding basic operational knowledge”</w:t>
-      </w:r>
-      <w:r>
-        <w:t xml:space="preserve"> </w:t>
-      </w:r>
-      <w:r>
-        <w:t xml:space="preserve">(p.</w:t>
-      </w:r>
-      <w:r>
-        <w:t xml:space="preserve"> </w:t>
-      </w:r>
-      <w:r>
-        <w:t xml:space="preserve">154) and deploying opacity in litigation to defeat the identification of affected classes (p. 182). Sekar</w:t>
-      </w:r>
-      <w:r>
-        <w:t xml:space="preserve"> </w:t>
-      </w:r>
-      <w:r>
-        <w:t xml:space="preserve">and Siddiq (2026) reach the same conclusion formally, finding that a platform does better disclosing</w:t>
-      </w:r>
-      <w:r>
-        <w:t xml:space="preserve"> </w:t>
-      </w:r>
-      <w:r>
-        <w:t xml:space="preserve">partial rather than complete information about buyer risk, because</w:t>
-      </w:r>
-      <w:r>
-        <w:t xml:space="preserve"> </w:t>
-      </w:r>
-      <w:r>
-        <w:t xml:space="preserve">“full transparency diminishes the</w:t>
-      </w:r>
-      <w:r>
-        <w:t xml:space="preserve"> </w:t>
-      </w:r>
-      <w:r>
-        <w:t xml:space="preserve">platform’s protective value and intensifies disintermediation incentives”</w:t>
-      </w:r>
-      <w:r>
-        <w:t xml:space="preserve"> </w:t>
-      </w:r>
-      <w:r>
-        <w:t xml:space="preserve">(Abstract). A transparent</w:t>
-      </w:r>
-      <w:r>
-        <w:t xml:space="preserve"> </w:t>
-      </w:r>
-      <w:r>
-        <w:t xml:space="preserve">bottleneck would still be a bottleneck, and a disclosed objective the coordinated actor has no standing to</w:t>
-      </w:r>
-      <w:r>
-        <w:t xml:space="preserve"> </w:t>
-      </w:r>
-      <w:r>
-        <w:t xml:space="preserve">contest is still an objective imposed on it.</w:t>
+        <w:t xml:space="preserve">Opacity preserves the rent. O’Reilly et al. (2024) argue that platforms extract rents through algorithmic</w:t>
+      </w:r>
+      <w:r>
+        <w:t xml:space="preserve"> </w:t>
+      </w:r>
+      <w:r>
+        <w:t xml:space="preserve">control over the allocation of attention, that the market for that allocation is opaque, and that the rents</w:t>
+      </w:r>
+      <w:r>
+        <w:t xml:space="preserve"> </w:t>
+      </w:r>
+      <w:r>
+        <w:t xml:space="preserve">follow from discretion over allocation rather than from any service rendered. Cohen (2017) documents the</w:t>
+      </w:r>
+      <w:r>
+        <w:t xml:space="preserve"> </w:t>
+      </w:r>
+      <w:r>
+        <w:t xml:space="preserve">strategy in operation: platforms treat algorithmic logics as zones of exclusivity,</w:t>
+      </w:r>
+      <w:r>
+        <w:t xml:space="preserve"> </w:t>
+      </w:r>
+      <w:r>
+        <w:t xml:space="preserve">“extracting transparency</w:t>
+      </w:r>
+      <w:r>
+        <w:t xml:space="preserve"> </w:t>
+      </w:r>
+      <w:r>
+        <w:t xml:space="preserve">from users but shielding basic operational knowledge”</w:t>
+      </w:r>
+      <w:r>
+        <w:t xml:space="preserve"> </w:t>
+      </w:r>
+      <w:r>
+        <w:t xml:space="preserve">(p. 154) and deploying opacity in litigation to</w:t>
+      </w:r>
+      <w:r>
+        <w:t xml:space="preserve"> </w:t>
+      </w:r>
+      <w:r>
+        <w:t xml:space="preserve">defeat the identification of affected classes (p. 182). Sekar and Siddiq (2026) reach the same conclusion</w:t>
+      </w:r>
+      <w:r>
+        <w:t xml:space="preserve"> </w:t>
+      </w:r>
+      <w:r>
+        <w:t xml:space="preserve">formally, finding that a platform does better disclosing partial rather than complete information about</w:t>
+      </w:r>
+      <w:r>
+        <w:t xml:space="preserve"> </w:t>
+      </w:r>
+      <w:r>
+        <w:t xml:space="preserve">buyer risk, because</w:t>
+      </w:r>
+      <w:r>
+        <w:t xml:space="preserve"> </w:t>
+      </w:r>
+      <w:r>
+        <w:t xml:space="preserve">“full transparency diminishes the platform’s protective value and intensifies</w:t>
+      </w:r>
+      <w:r>
+        <w:t xml:space="preserve"> </w:t>
+      </w:r>
+      <w:r>
+        <w:t xml:space="preserve">disintermediation incentives”</w:t>
+      </w:r>
+      <w:r>
+        <w:t xml:space="preserve"> </w:t>
+      </w:r>
+      <w:r>
+        <w:t xml:space="preserve">(Abstract). A transparent bottleneck would still be a bottleneck, and a</w:t>
+      </w:r>
+      <w:r>
+        <w:t xml:space="preserve"> </w:t>
+      </w:r>
+      <w:r>
+        <w:t xml:space="preserve">disclosed objective the coordinated actor has no standing to contest is still an objective imposed on it.</w:t>
       </w:r>
     </w:p>
     <w:bookmarkEnd w:id="17"/>
@@ -1793,7 +1787,7 @@
         <w:t xml:space="preserve"> </w:t>
       </w:r>
       <w:r>
-        <w:t xml:space="preserve">2026). It has three parts. The first is inferential, the capacity to model the behavior of a system one</w:t>
+        <w:t xml:space="preserve">2026). It has three parts: the first is inferential, the capacity to model the behavior of a system one</w:t>
       </w:r>
       <w:r>
         <w:t xml:space="preserve"> </w:t>
@@ -1831,13 +1825,13 @@
         <w:pStyle w:val="BodyText"/>
       </w:pPr>
       <w:r>
-        <w:t xml:space="preserve">None of those three parts is new, and the integration of them is not new either. DeVito (2021) defines</w:t>
-      </w:r>
-      <w:r>
-        <w:t xml:space="preserve"> </w:t>
-      </w:r>
-      <w:r>
-        <w:t xml:space="preserve">algorithmic literacy as</w:t>
+        <w:t xml:space="preserve">The literature already names the three parts and holds them together. DeVito (2021) defines algorithmic</w:t>
+      </w:r>
+      <w:r>
+        <w:t xml:space="preserve"> </w:t>
+      </w:r>
+      <w:r>
+        <w:t xml:space="preserve">literacy as</w:t>
       </w:r>
       <w:r>
         <w:t xml:space="preserve"> </w:t>
@@ -2065,7 +2059,7 @@
         <w:pStyle w:val="BodyText"/>
       </w:pPr>
       <w:r>
-        <w:t xml:space="preserve">The shape is visible in an ordinary week. A seller’s placement drops. She checks the obvious things: price,</w:t>
+        <w:t xml:space="preserve">The shape is visible in an ordinary week: a seller’s placement drops. She checks the obvious things: price,</w:t>
       </w:r>
       <w:r>
         <w:t xml:space="preserve"> </w:t>
@@ -2335,7 +2329,7 @@
         <w:pStyle w:val="FirstParagraph"/>
       </w:pPr>
       <w:r>
-        <w:t xml:space="preserve">Two questions do the work, and they are not the same question.</w:t>
+        <w:t xml:space="preserve">The diagnostic is two operations that can disagree.</w:t>
       </w:r>
     </w:p>
     <w:bookmarkStart w:id="20" w:name="X586926fae6deff6406a1b405d418b8ff96f6c63"/>
@@ -2376,7 +2370,7 @@
         <w:t xml:space="preserve"> </w:t>
       </w:r>
       <w:r>
-        <w:t xml:space="preserve">split of the arrangement reproduces. Call that second kind constitutive. Governing it, if it can be</w:t>
+        <w:t xml:space="preserve">split of the arrangement reproduces. Call that second kind constitutive: governing it, if it can be</w:t>
       </w:r>
       <w:r>
         <w:t xml:space="preserve"> </w:t>
@@ -2402,13 +2396,13 @@
         <w:t xml:space="preserve"> </w:t>
       </w:r>
       <w:r>
-        <w:t xml:space="preserve">plain counterfactual that follows is enough here: restore a direct link between the two parties and see</w:t>
-      </w:r>
-      <w:r>
-        <w:t xml:space="preserve"> </w:t>
-      </w:r>
-      <w:r>
-        <w:t xml:space="preserve">whether the mediator still binds.</w:t>
+        <w:t xml:space="preserve">plain counterfactual is enough here: restore a direct link between the two parties and see whether the</w:t>
+      </w:r>
+      <w:r>
+        <w:t xml:space="preserve"> </w:t>
+      </w:r>
+      <w:r>
+        <w:t xml:space="preserve">mediator still binds.</w:t>
       </w:r>
     </w:p>
     <w:bookmarkEnd w:id="20"/>
@@ -2494,25 +2488,19 @@
         <w:t xml:space="preserve"> </w:t>
       </w:r>
       <w:r>
-        <w:t xml:space="preserve">law dissolves the dealer’s position. Two further cases complete the picture. A mediator that was never in</w:t>
-      </w:r>
-      <w:r>
-        <w:t xml:space="preserve"> </w:t>
-      </w:r>
-      <w:r>
-        <w:t xml:space="preserve">the coordination’s core is reducible: the parties can already deal directly. A mediator that keeps a</w:t>
-      </w:r>
-      <w:r>
-        <w:t xml:space="preserve"> </w:t>
-      </w:r>
-      <w:r>
-        <w:t xml:space="preserve">constitutive role under the open tie while losing part of its integration is a partial mediator: real</w:t>
-      </w:r>
-      <w:r>
-        <w:t xml:space="preserve"> </w:t>
-      </w:r>
-      <w:r>
-        <w:t xml:space="preserve">integrating work alongside a bypassable gate.</w:t>
+        <w:t xml:space="preserve">law dissolves the dealer’s position. A mediator that was never in the coordination’s core is reducible: the</w:t>
+      </w:r>
+      <w:r>
+        <w:t xml:space="preserve"> </w:t>
+      </w:r>
+      <w:r>
+        <w:t xml:space="preserve">parties can already deal directly. A mediator that keeps a constitutive role under the open tie while</w:t>
+      </w:r>
+      <w:r>
+        <w:t xml:space="preserve"> </w:t>
+      </w:r>
+      <w:r>
+        <w:t xml:space="preserve">losing part of its integration is a partial mediator: real integrating work alongside a bypassable gate.</w:t>
       </w:r>
     </w:p>
     <w:p>
@@ -2608,49 +2596,49 @@
         <w:pStyle w:val="BodyText"/>
       </w:pPr>
       <w:r>
-        <w:t xml:space="preserve">The test resembles three others, and the operation differs from each. A closer relative comes later.</w:t>
-      </w:r>
-      <w:r>
-        <w:t xml:space="preserve"> </w:t>
-      </w:r>
-      <w:r>
-        <w:t xml:space="preserve">Brokerage research asks what a broker gains from standing between disconnected parties and whether another</w:t>
-      </w:r>
-      <w:r>
-        <w:t xml:space="preserve"> </w:t>
-      </w:r>
-      <w:r>
-        <w:t xml:space="preserve">actor could occupy the position (Burt, 2004; Obstfeld, 2005), and Ryall and Sorenson (2007) formalize when</w:t>
-      </w:r>
-      <w:r>
-        <w:t xml:space="preserve"> </w:t>
-      </w:r>
-      <w:r>
-        <w:t xml:space="preserve">a broker is essential to the value a coalition creates. Transaction cost economics asks whether a firm</w:t>
-      </w:r>
-      <w:r>
-        <w:t xml:space="preserve"> </w:t>
-      </w:r>
-      <w:r>
-        <w:t xml:space="preserve">should perform a transaction internally or buy it (Williamson, 1975). Competition law’s</w:t>
-      </w:r>
-      <w:r>
-        <w:t xml:space="preserve"> </w:t>
-      </w:r>
-      <w:r>
-        <w:t xml:space="preserve">essential-facilities doctrine asks whether an excluded rival could viably duplicate the facility it seeks</w:t>
-      </w:r>
-      <w:r>
-        <w:t xml:space="preserve"> </w:t>
-      </w:r>
-      <w:r>
-        <w:t xml:space="preserve">access to. Each of these deletes or substitutes the mediator: they operate on a node. The bypass test</w:t>
-      </w:r>
-      <w:r>
-        <w:t xml:space="preserve"> </w:t>
-      </w:r>
-      <w:r>
-        <w:t xml:space="preserve">leaves the mediator in place and adds a tie: it operates on an edge.</w:t>
+        <w:t xml:space="preserve">The test resembles three others, and the operation differs from each. Brokerage research asks what a broker</w:t>
+      </w:r>
+      <w:r>
+        <w:t xml:space="preserve"> </w:t>
+      </w:r>
+      <w:r>
+        <w:t xml:space="preserve">gains from standing between disconnected parties and whether another actor could occupy the position (Burt,</w:t>
+      </w:r>
+      <w:r>
+        <w:t xml:space="preserve"> </w:t>
+      </w:r>
+      <w:r>
+        <w:t xml:space="preserve">2004; Obstfeld, 2005), and Ryall and Sorenson (2007) formalize when a broker is essential to the value a</w:t>
+      </w:r>
+      <w:r>
+        <w:t xml:space="preserve"> </w:t>
+      </w:r>
+      <w:r>
+        <w:t xml:space="preserve">coalition creates. Transaction cost economics asks whether a firm should perform a transaction internally</w:t>
+      </w:r>
+      <w:r>
+        <w:t xml:space="preserve"> </w:t>
+      </w:r>
+      <w:r>
+        <w:t xml:space="preserve">or buy it (Williamson, 1975). Competition law’s essential-facilities doctrine asks whether an excluded</w:t>
+      </w:r>
+      <w:r>
+        <w:t xml:space="preserve"> </w:t>
+      </w:r>
+      <w:r>
+        <w:t xml:space="preserve">rival could viably duplicate the facility it seeks access to. Each of these deletes or substitutes the</w:t>
+      </w:r>
+      <w:r>
+        <w:t xml:space="preserve"> </w:t>
+      </w:r>
+      <w:r>
+        <w:t xml:space="preserve">mediator: they operate on a node. The bypass test leaves the mediator in place and adds a tie: it operates</w:t>
+      </w:r>
+      <w:r>
+        <w:t xml:space="preserve"> </w:t>
+      </w:r>
+      <w:r>
+        <w:t xml:space="preserve">on an edge.</w:t>
       </w:r>
     </w:p>
     <w:p>
@@ -2762,7 +2750,7 @@
         <w:t xml:space="preserve"> </w:t>
       </w:r>
       <w:r>
-        <w:t xml:space="preserve">contingent as a gate. Node and edge disagree on the gate. They need not disagree on the rail. The Digital</w:t>
+        <w:t xml:space="preserve">contingent as a gate. Node and edge disagree on the gate; they need not disagree on the rail. The Digital</w:t>
       </w:r>
       <w:r>
         <w:t xml:space="preserve"> </w:t>
@@ -2874,7 +2862,7 @@
         <w:t xml:space="preserve"> </w:t>
       </w:r>
       <w:r>
-        <w:t xml:space="preserve">fixed. Gu and Zhu (2021), in a field experiment on a freelance marketplace, find that the platform’s own</w:t>
+        <w:t xml:space="preserve">fixed: Gu and Zhu (2021), in a field experiment on a freelance marketplace, find that the platform’s own</w:t>
       </w:r>
       <w:r>
         <w:t xml:space="preserve"> </w:t>
@@ -2922,13 +2910,13 @@
         <w:t xml:space="preserve"> </w:t>
       </w:r>
       <w:r>
-        <w:t xml:space="preserve">not produce voice. It forecloses exit and leaves voice as the residual lever, available against a contingent gate too</w:t>
-      </w:r>
-      <w:r>
-        <w:t xml:space="preserve"> </w:t>
-      </w:r>
-      <w:r>
-        <w:t xml:space="preserve">and the only one left where the mediation is necessary. Whether a coordinated actor</w:t>
+        <w:t xml:space="preserve">not produce voice: it forecloses exit and leaves voice as the residual lever, available against a</w:t>
+      </w:r>
+      <w:r>
+        <w:t xml:space="preserve"> </w:t>
+      </w:r>
+      <w:r>
+        <w:t xml:space="preserve">contingent gate too, and the only lever left where the mediation is necessary. Whether a coordinated actor</w:t>
       </w:r>
       <w:r>
         <w:t xml:space="preserve"> </w:t>
@@ -3046,19 +3034,7 @@
         <w:t xml:space="preserve"> </w:t>
       </w:r>
       <w:r>
-        <w:t xml:space="preserve">left exactly where it commands the least leverage, and whatever force it has must be supplied by</w:t>
-      </w:r>
-      <w:r>
-        <w:t xml:space="preserve"> </w:t>
-      </w:r>
-      <w:r>
-        <w:t xml:space="preserve">institutions. Building those institutions is what the literate and digital forms of sovereignty leave</w:t>
-      </w:r>
-      <w:r>
-        <w:t xml:space="preserve"> </w:t>
-      </w:r>
-      <w:r>
-        <w:t xml:space="preserve">untheorized.</w:t>
+        <w:t xml:space="preserve">left exactly where it commands the least leverage.</w:t>
       </w:r>
     </w:p>
     <w:bookmarkEnd w:id="22"/>
@@ -3076,75 +3052,81 @@
         <w:pStyle w:val="FirstParagraph"/>
       </w:pPr>
       <w:r>
-        <w:t xml:space="preserve">A real platform is several mediators wearing one name, and the diagnostic classifies functions, not firms.</w:t>
-      </w:r>
-      <w:r>
-        <w:t xml:space="preserve"> </w:t>
-      </w:r>
-      <w:r>
-        <w:t xml:space="preserve">The same company can be necessary in one of its functions and contingent in another, and the coordinated</w:t>
-      </w:r>
-      <w:r>
-        <w:t xml:space="preserve"> </w:t>
-      </w:r>
-      <w:r>
-        <w:t xml:space="preserve">actor’s strategy differs by function. A payment network authorizes transactions, a determination that</w:t>
-      </w:r>
-      <w:r>
-        <w:t xml:space="preserve"> </w:t>
-      </w:r>
-      <w:r>
-        <w:t xml:space="preserve">depends jointly on the merchant’s request and the issuer’s approval and that neither could produce alone,</w:t>
-      </w:r>
-      <w:r>
-        <w:t xml:space="preserve"> </w:t>
-      </w:r>
-      <w:r>
-        <w:t xml:space="preserve">which is necessary integrating work. The same network enforces a rule against steering the customer toward</w:t>
-      </w:r>
-      <w:r>
-        <w:t xml:space="preserve"> </w:t>
-      </w:r>
-      <w:r>
-        <w:t xml:space="preserve">a cheaper method at the till, a gate whose force comes from the card both parties already hold, which is</w:t>
-      </w:r>
-      <w:r>
-        <w:t xml:space="preserve"> </w:t>
-      </w:r>
-      <w:r>
-        <w:t xml:space="preserve">contingent. A large marketplace fulfills orders through logistics that no direct seller-to-buyer tie</w:t>
-      </w:r>
-      <w:r>
-        <w:t xml:space="preserve"> </w:t>
-      </w:r>
-      <w:r>
-        <w:t xml:space="preserve">reproduces at scale, which is necessary. It matches demand to supply, real integrating work that buyers can</w:t>
-      </w:r>
-      <w:r>
-        <w:t xml:space="preserve"> </w:t>
-      </w:r>
-      <w:r>
-        <w:t xml:space="preserve">bypass for goods they already know, which is partial. It gates which seller a buyer sees, a toll sellers</w:t>
-      </w:r>
-      <w:r>
-        <w:t xml:space="preserve"> </w:t>
-      </w:r>
-      <w:r>
-        <w:t xml:space="preserve">pay to pass, which is contingent. And it resells goods it buys, a plain conduit that a brand able to reach</w:t>
-      </w:r>
-      <w:r>
-        <w:t xml:space="preserve"> </w:t>
-      </w:r>
-      <w:r>
-        <w:t xml:space="preserve">customers directly can route around, which is reducible. One firm, four kinds of mediator at once.</w:t>
-      </w:r>
-    </w:p>
-    <w:p>
-      <w:pPr>
-        <w:pStyle w:val="BodyText"/>
-      </w:pPr>
-      <w:r>
-        <w:t xml:space="preserve">The portfolio view changes what a manager should do. A coordinated actor’s dependence is not monolithic.</w:t>
+        <w:t xml:space="preserve">The contingent/necessary pair just drawn does not describe firms. A real platform is several mediators</w:t>
+      </w:r>
+      <w:r>
+        <w:t xml:space="preserve"> </w:t>
+      </w:r>
+      <w:r>
+        <w:t xml:space="preserve">wearing one name, and the diagnostic classifies functions, not firms. The same company can be necessary in</w:t>
+      </w:r>
+      <w:r>
+        <w:t xml:space="preserve"> </w:t>
+      </w:r>
+      <w:r>
+        <w:t xml:space="preserve">one of its functions and contingent in another, and the coordinated actor’s strategy differs by function. A</w:t>
+      </w:r>
+      <w:r>
+        <w:t xml:space="preserve"> </w:t>
+      </w:r>
+      <w:r>
+        <w:t xml:space="preserve">payment network authorizes transactions, a determination that depends jointly on the merchant’s request and</w:t>
+      </w:r>
+      <w:r>
+        <w:t xml:space="preserve"> </w:t>
+      </w:r>
+      <w:r>
+        <w:t xml:space="preserve">the issuer’s approval and that neither could produce alone, which is necessary integrating work. The same</w:t>
+      </w:r>
+      <w:r>
+        <w:t xml:space="preserve"> </w:t>
+      </w:r>
+      <w:r>
+        <w:t xml:space="preserve">network enforces a rule against steering the customer toward a cheaper method at the till, a gate whose</w:t>
+      </w:r>
+      <w:r>
+        <w:t xml:space="preserve"> </w:t>
+      </w:r>
+      <w:r>
+        <w:t xml:space="preserve">force comes from the card both parties already hold, which is contingent. A large marketplace fulfills</w:t>
+      </w:r>
+      <w:r>
+        <w:t xml:space="preserve"> </w:t>
+      </w:r>
+      <w:r>
+        <w:t xml:space="preserve">orders through logistics that no direct seller-to-buyer tie reproduces at scale, which is necessary. It</w:t>
+      </w:r>
+      <w:r>
+        <w:t xml:space="preserve"> </w:t>
+      </w:r>
+      <w:r>
+        <w:t xml:space="preserve">matches demand to supply, real integrating work that buyers can bypass for goods they already know, which</w:t>
+      </w:r>
+      <w:r>
+        <w:t xml:space="preserve"> </w:t>
+      </w:r>
+      <w:r>
+        <w:t xml:space="preserve">is partial. It gates which seller a buyer sees, a toll sellers pay to pass, which is contingent. And it</w:t>
+      </w:r>
+      <w:r>
+        <w:t xml:space="preserve"> </w:t>
+      </w:r>
+      <w:r>
+        <w:t xml:space="preserve">resells goods it buys, a plain conduit that a brand able to reach customers directly can route around,</w:t>
+      </w:r>
+      <w:r>
+        <w:t xml:space="preserve"> </w:t>
+      </w:r>
+      <w:r>
+        <w:t xml:space="preserve">which is reducible. One firm, four kinds of mediator at once.</w:t>
+      </w:r>
+    </w:p>
+    <w:p>
+      <w:pPr>
+        <w:pStyle w:val="BodyText"/>
+      </w:pPr>
+      <w:r>
+        <w:t xml:space="preserve">The portfolio view changes what a manager should do: a coordinated actor’s dependence is not monolithic.</w:t>
       </w:r>
       <w:r>
         <w:t xml:space="preserve"> </w:t>
@@ -3170,43 +3152,37 @@
         <w:pStyle w:val="BodyText"/>
       </w:pPr>
       <w:r>
-        <w:t xml:space="preserve">A partial verdict has its own answer. Contest the bypassable part and accept the integrating one, treating</w:t>
-      </w:r>
-      <w:r>
-        <w:t xml:space="preserve"> </w:t>
-      </w:r>
-      <w:r>
-        <w:t xml:space="preserve">them as separate decisions instead of averaging them into a single posture. Modularity research supplies</w:t>
-      </w:r>
-      <w:r>
-        <w:t xml:space="preserve"> </w:t>
-      </w:r>
-      <w:r>
-        <w:t xml:space="preserve">the criterion for where the two come apart: cut at the thin crossing points, where the interface between</w:t>
-      </w:r>
-      <w:r>
-        <w:t xml:space="preserve"> </w:t>
-      </w:r>
-      <w:r>
-        <w:t xml:space="preserve">functions is narrow enough that separating them costs little (Baldwin, 2008). Firms that both make and buy</w:t>
-      </w:r>
-      <w:r>
-        <w:t xml:space="preserve"> </w:t>
-      </w:r>
-      <w:r>
-        <w:t xml:space="preserve">the same input are not hedging between two options but pursuing a distinct strategy with its own logic</w:t>
-      </w:r>
-      <w:r>
-        <w:t xml:space="preserve"> </w:t>
-      </w:r>
-      <w:r>
-        <w:t xml:space="preserve">(Parmigiani, 2007), and the same holds for an actor that fights one function of a platform while depending</w:t>
-      </w:r>
-      <w:r>
-        <w:t xml:space="preserve"> </w:t>
-      </w:r>
-      <w:r>
-        <w:t xml:space="preserve">on another.</w:t>
+        <w:t xml:space="preserve">Contest the bypassable part and accept the integrating one, treating them as separate decisions instead of</w:t>
+      </w:r>
+      <w:r>
+        <w:t xml:space="preserve"> </w:t>
+      </w:r>
+      <w:r>
+        <w:t xml:space="preserve">averaging them into a single posture. Modularity research supplies the criterion for where the two come</w:t>
+      </w:r>
+      <w:r>
+        <w:t xml:space="preserve"> </w:t>
+      </w:r>
+      <w:r>
+        <w:t xml:space="preserve">apart: cut at the thin crossing points, where the interface between functions is narrow enough that</w:t>
+      </w:r>
+      <w:r>
+        <w:t xml:space="preserve"> </w:t>
+      </w:r>
+      <w:r>
+        <w:t xml:space="preserve">separating them costs little (Baldwin, 2008). Firms that both make and buy the same input are not hedging</w:t>
+      </w:r>
+      <w:r>
+        <w:t xml:space="preserve"> </w:t>
+      </w:r>
+      <w:r>
+        <w:t xml:space="preserve">between two options but pursuing a distinct strategy with its own logic (Parmigiani, 2007), and the same</w:t>
+      </w:r>
+      <w:r>
+        <w:t xml:space="preserve"> </w:t>
+      </w:r>
+      <w:r>
+        <w:t xml:space="preserve">holds for an actor that fights one function of a platform while depending on another.</w:t>
       </w:r>
     </w:p>
     <w:bookmarkEnd w:id="23"/>
@@ -3292,7 +3268,7 @@
         <w:t xml:space="preserve"> </w:t>
       </w:r>
       <w:r>
-        <w:t xml:space="preserve">Demand aggregation survives the bypass for that traveler, and it is necessary. The verdict is a split, and</w:t>
+        <w:t xml:space="preserve">Demand aggregation survives the bypass for that traveler, and it is necessary: the verdict is a split, and</w:t>
       </w:r>
       <w:r>
         <w:t xml:space="preserve"> </w:t>
@@ -3623,7 +3599,7 @@
         <w:pStyle w:val="BodyText"/>
       </w:pPr>
       <w:r>
-        <w:t xml:space="preserve">Relational autonomy supplies the next piece. Autonomy is constituted through the relationships that</w:t>
+        <w:t xml:space="preserve">Relational autonomy supplies the next piece: autonomy is constituted through the relationships that</w:t>
       </w:r>
       <w:r>
         <w:t xml:space="preserve"> </w:t>
@@ -3687,7 +3663,7 @@
         <w:t xml:space="preserve"> </w:t>
       </w:r>
       <w:r>
-        <w:t xml:space="preserve">platform is not an unowned pasture. It is enclosed, owned and tuned by the mediator, so the coordinated</w:t>
+        <w:t xml:space="preserve">platform is not an unowned pasture: it is enclosed, owned and tuned by the mediator, so the coordinated</w:t>
       </w:r>
       <w:r>
         <w:t xml:space="preserve"> </w:t>
@@ -3749,37 +3725,37 @@
         <w:t xml:space="preserve"> </w:t>
       </w:r>
       <w:r>
-        <w:t xml:space="preserve">occupies the position of being coordinated through a necessary mediation bears coordinative</w:t>
-      </w:r>
-      <w:r>
-        <w:t xml:space="preserve"> </w:t>
-      </w:r>
-      <w:r>
-        <w:t xml:space="preserve">sovereignty. Republican theory has already licensed the move, extending non-domination to corporate bodies</w:t>
-      </w:r>
-      <w:r>
-        <w:t xml:space="preserve"> </w:t>
-      </w:r>
-      <w:r>
-        <w:t xml:space="preserve">while treating a corporate body’s freedom as valuable for the sake of its members (Pettit, 2016). The same</w:t>
-      </w:r>
-      <w:r>
-        <w:t xml:space="preserve"> </w:t>
-      </w:r>
-      <w:r>
-        <w:t xml:space="preserve">holds here. A firm’s coordinative sovereignty matters because of what it secures for the people who make it</w:t>
-      </w:r>
-      <w:r>
-        <w:t xml:space="preserve"> </w:t>
-      </w:r>
-      <w:r>
-        <w:t xml:space="preserve">up. Where the two diverge, the members’ standing governs. A reader may decline that priority and keep the</w:t>
-      </w:r>
-      <w:r>
-        <w:t xml:space="preserve"> </w:t>
-      </w:r>
-      <w:r>
-        <w:t xml:space="preserve">rest. The construct is one; the measurement differs by level, and section 9 takes that up.</w:t>
+        <w:t xml:space="preserve">occupies the position of being coordinated through a necessary mediation bears coordinative sovereignty.</w:t>
+      </w:r>
+      <w:r>
+        <w:t xml:space="preserve"> </w:t>
+      </w:r>
+      <w:r>
+        <w:t xml:space="preserve">Republican theory has already licensed the move, extending non-domination to corporate bodies while</w:t>
+      </w:r>
+      <w:r>
+        <w:t xml:space="preserve"> </w:t>
+      </w:r>
+      <w:r>
+        <w:t xml:space="preserve">treating a corporate body’s freedom as valuable for the sake of its members (Pettit, 2016). A firm’s</w:t>
+      </w:r>
+      <w:r>
+        <w:t xml:space="preserve"> </w:t>
+      </w:r>
+      <w:r>
+        <w:t xml:space="preserve">coordinative sovereignty matters because of what it secures for the people who make it up. Where the two</w:t>
+      </w:r>
+      <w:r>
+        <w:t xml:space="preserve"> </w:t>
+      </w:r>
+      <w:r>
+        <w:t xml:space="preserve">diverge, the members’ standing governs. A reader may decline that priority and keep the rest. The construct</w:t>
+      </w:r>
+      <w:r>
+        <w:t xml:space="preserve"> </w:t>
+      </w:r>
+      <w:r>
+        <w:t xml:space="preserve">is one; the measurement differs by level, and section 9 takes that up.</w:t>
       </w:r>
     </w:p>
     <w:p>
@@ -3861,7 +3837,7 @@
         <w:t xml:space="preserve"> </w:t>
       </w:r>
       <w:r>
-        <w:t xml:space="preserve">managerial decay inside cooperatives. The remaining problem is structural. Worker ownership can change who</w:t>
+        <w:t xml:space="preserve">managerial decay inside cooperatives. The remaining problem is structural: worker ownership can change who</w:t>
       </w:r>
       <w:r>
         <w:t xml:space="preserve"> </w:t>
@@ -3879,13 +3855,13 @@
         <w:t xml:space="preserve"> </w:t>
       </w:r>
       <w:r>
-        <w:t xml:space="preserve">within a necessary mediation outlives the question of who holds the title. E. Anderson (2017) makes</w:t>
-      </w:r>
-      <w:r>
-        <w:t xml:space="preserve"> </w:t>
-      </w:r>
-      <w:r>
-        <w:t xml:space="preserve">the parallel argument for the firm, where the right to quit has long been treated as the answer to employer</w:t>
+        <w:t xml:space="preserve">within a necessary mediation outlives the question of who holds the title. E. Anderson (2017) makes the</w:t>
+      </w:r>
+      <w:r>
+        <w:t xml:space="preserve"> </w:t>
+      </w:r>
+      <w:r>
+        <w:t xml:space="preserve">parallel argument for the firm, where the right to quit has long been treated as the answer to employer</w:t>
       </w:r>
       <w:r>
         <w:t xml:space="preserve"> </w:t>
@@ -3937,7 +3913,7 @@
         <w:pStyle w:val="BodyText"/>
       </w:pPr>
       <w:r>
-        <w:t xml:space="preserve">Algorithmacy is the precondition. An actor cannot contest a mediator’s arbitrary power without modeling how</w:t>
+        <w:t xml:space="preserve">Algorithmacy is the precondition: an actor cannot contest a mediator’s arbitrary power without modeling how</w:t>
       </w:r>
       <w:r>
         <w:t xml:space="preserve"> </w:t>
@@ -3999,73 +3975,73 @@
         <w:pStyle w:val="BodyText"/>
       </w:pPr>
       <w:r>
-        <w:t xml:space="preserve">Interoperability shows this most clearly. Where a mediator’s position is contingent, held by lock-in,</w:t>
-      </w:r>
-      <w:r>
-        <w:t xml:space="preserve"> </w:t>
-      </w:r>
-      <w:r>
-        <w:t xml:space="preserve">mandated interoperability and data portability lower the cost of the direct tie and restore a measure of</w:t>
-      </w:r>
-      <w:r>
-        <w:t xml:space="preserve"> </w:t>
-      </w:r>
-      <w:r>
-        <w:t xml:space="preserve">the old sovereignty of independence. Against a necessary mediator the same instrument does something else</w:t>
-      </w:r>
-      <w:r>
-        <w:t xml:space="preserve"> </w:t>
-      </w:r>
-      <w:r>
-        <w:t xml:space="preserve">entirely. A right to interoperate with a facility no one can bypass does not let the actor leave. It forces</w:t>
-      </w:r>
-      <w:r>
-        <w:t xml:space="preserve"> </w:t>
-      </w:r>
-      <w:r>
-        <w:t xml:space="preserve">the mediator to grant access on regulated terms. That is a voice instrument, and competition law has long</w:t>
-      </w:r>
-      <w:r>
-        <w:t xml:space="preserve"> </w:t>
-      </w:r>
-      <w:r>
-        <w:t xml:space="preserve">understood it as one under the essential-facilities logic it applies to infrastructure that cannot be</w:t>
-      </w:r>
-      <w:r>
-        <w:t xml:space="preserve"> </w:t>
-      </w:r>
-      <w:r>
-        <w:t xml:space="preserve">duplicated. The Digital Markets Act’s access and interoperability obligations carry the logic into platform</w:t>
-      </w:r>
-      <w:r>
-        <w:t xml:space="preserve"> </w:t>
-      </w:r>
-      <w:r>
-        <w:t xml:space="preserve">regulation. Reviewing the Act’s first years, the European Commission (2026) reports that messaging</w:t>
-      </w:r>
-      <w:r>
-        <w:t xml:space="preserve"> </w:t>
-      </w:r>
-      <w:r>
-        <w:t xml:space="preserve">interoperability has brought new providers into the market, including a European SME, while judging it too</w:t>
-      </w:r>
-      <w:r>
-        <w:t xml:space="preserve"> </w:t>
-      </w:r>
-      <w:r>
-        <w:t xml:space="preserve">early to extend the same obligation to social networking: an external study there showed mixed evidence,</w:t>
-      </w:r>
-      <w:r>
-        <w:t xml:space="preserve"> </w:t>
-      </w:r>
-      <w:r>
-        <w:t xml:space="preserve">greater technical complexity, and limited demand. A regulator sorting functions by whether interoperability</w:t>
-      </w:r>
-      <w:r>
-        <w:t xml:space="preserve"> </w:t>
-      </w:r>
-      <w:r>
-        <w:t xml:space="preserve">bites is running the diagnostic under another name.</w:t>
+        <w:t xml:space="preserve">Where a mediator’s position is contingent, held by lock-in, mandated interoperability and data portability</w:t>
+      </w:r>
+      <w:r>
+        <w:t xml:space="preserve"> </w:t>
+      </w:r>
+      <w:r>
+        <w:t xml:space="preserve">lower the cost of the direct tie and restore a measure of the old sovereignty of independence. Against a</w:t>
+      </w:r>
+      <w:r>
+        <w:t xml:space="preserve"> </w:t>
+      </w:r>
+      <w:r>
+        <w:t xml:space="preserve">necessary mediator the same instrument does something else entirely. A right to interoperate with a</w:t>
+      </w:r>
+      <w:r>
+        <w:t xml:space="preserve"> </w:t>
+      </w:r>
+      <w:r>
+        <w:t xml:space="preserve">facility no one can bypass does not let the actor leave. It forces the mediator to grant access on</w:t>
+      </w:r>
+      <w:r>
+        <w:t xml:space="preserve"> </w:t>
+      </w:r>
+      <w:r>
+        <w:t xml:space="preserve">regulated terms. That is a voice instrument, and competition law has long understood it as one under the</w:t>
+      </w:r>
+      <w:r>
+        <w:t xml:space="preserve"> </w:t>
+      </w:r>
+      <w:r>
+        <w:t xml:space="preserve">essential-facilities logic it applies to infrastructure that cannot be duplicated. The Digital Markets</w:t>
+      </w:r>
+      <w:r>
+        <w:t xml:space="preserve"> </w:t>
+      </w:r>
+      <w:r>
+        <w:t xml:space="preserve">Act’s access and interoperability obligations carry the logic into platform regulation. Reviewing the Act’s</w:t>
+      </w:r>
+      <w:r>
+        <w:t xml:space="preserve"> </w:t>
+      </w:r>
+      <w:r>
+        <w:t xml:space="preserve">first years, the European Commission (2026) reports that messaging interoperability has brought new</w:t>
+      </w:r>
+      <w:r>
+        <w:t xml:space="preserve"> </w:t>
+      </w:r>
+      <w:r>
+        <w:t xml:space="preserve">providers into the market, including a European SME, while judging it too early to extend the same</w:t>
+      </w:r>
+      <w:r>
+        <w:t xml:space="preserve"> </w:t>
+      </w:r>
+      <w:r>
+        <w:t xml:space="preserve">obligation to social networking: an external study there showed mixed evidence, greater technical</w:t>
+      </w:r>
+      <w:r>
+        <w:t xml:space="preserve"> </w:t>
+      </w:r>
+      <w:r>
+        <w:t xml:space="preserve">complexity, and limited demand. A regulator sorting functions by whether interoperability bites is running</w:t>
+      </w:r>
+      <w:r>
+        <w:t xml:space="preserve"> </w:t>
+      </w:r>
+      <w:r>
+        <w:t xml:space="preserve">the diagnostic under another name.</w:t>
       </w:r>
     </w:p>
     <w:p>
@@ -4689,227 +4665,209 @@
         <w:t xml:space="preserve"> </w:t>
       </w:r>
       <w:r>
-        <w:t xml:space="preserve">separates two phenomena that vary independently across firms. Digital</w:t>
-      </w:r>
-      <w:r>
-        <w:t xml:space="preserve"> </w:t>
-      </w:r>
-      <w:r>
-        <w:t xml:space="preserve">sovereignty is a literacy construct, measuring an organization’s capacity to read and control its data,</w:t>
-      </w:r>
-      <w:r>
-        <w:t xml:space="preserve"> </w:t>
-      </w:r>
-      <w:r>
-        <w:t xml:space="preserve">infrastructure, and code. Coordinative sovereignty is an algorithmacy construct, measuring an</w:t>
-      </w:r>
-      <w:r>
-        <w:t xml:space="preserve"> </w:t>
-      </w:r>
-      <w:r>
-        <w:t xml:space="preserve">organization’s standing within the algorithmic coordination on which it depends. A firm can be high on the</w:t>
-      </w:r>
-      <w:r>
-        <w:t xml:space="preserve"> </w:t>
-      </w:r>
-      <w:r>
-        <w:t xml:space="preserve">first and low on the second, impeccably compliant and strategically captured, and the two predict different</w:t>
-      </w:r>
-      <w:r>
-        <w:t xml:space="preserve"> </w:t>
-      </w:r>
-      <w:r>
-        <w:t xml:space="preserve">outcomes.</w:t>
-      </w:r>
-    </w:p>
-    <w:p>
-      <w:pPr>
-        <w:pStyle w:val="BodyText"/>
-      </w:pPr>
-      <w:r>
-        <w:t xml:space="preserve">The independent variation shows in concrete cases. An application developer or a marketplace seller can own</w:t>
-      </w:r>
-      <w:r>
-        <w:t xml:space="preserve"> </w:t>
-      </w:r>
-      <w:r>
-        <w:t xml:space="preserve">its code and data, hold data-portability rights, and comply fully with the GDPR and the Digital Markets</w:t>
-      </w:r>
-      <w:r>
-        <w:t xml:space="preserve"> </w:t>
-      </w:r>
-      <w:r>
-        <w:t xml:space="preserve">Act, and still hold no leverage over the ranking and review algorithms that set its visibility (Cutolo &amp;</w:t>
-      </w:r>
-      <w:r>
-        <w:t xml:space="preserve"> </w:t>
-      </w:r>
-      <w:r>
-        <w:t xml:space="preserve">Kenney, 2021). Enforcement has reached platform conduct without reaching that layer: the European</w:t>
-      </w:r>
-      <w:r>
-        <w:t xml:space="preserve"> </w:t>
-      </w:r>
-      <w:r>
-        <w:t xml:space="preserve">Commission fined Apple €500 million in April 2025 for restricting how developers steer users to offers</w:t>
-      </w:r>
-      <w:r>
-        <w:t xml:space="preserve"> </w:t>
-      </w:r>
-      <w:r>
-        <w:t xml:space="preserve">outside its App Store (European Commission, 2025b), a decision Apple has appealed (Case T-438/25). Ranking</w:t>
-      </w:r>
-      <w:r>
-        <w:t xml:space="preserve"> </w:t>
-      </w:r>
-      <w:r>
-        <w:t xml:space="preserve">transparency is a separate and earlier obligation, set by the 2019 Platform-to-Business Regulation and the</w:t>
-      </w:r>
-      <w:r>
-        <w:t xml:space="preserve"> </w:t>
-      </w:r>
-      <w:r>
-        <w:t xml:space="preserve">Digital Services Act. That Regulation does more than disclose, since it also requires internal</w:t>
-      </w:r>
-      <w:r>
-        <w:t xml:space="preserve"> </w:t>
-      </w:r>
-      <w:r>
-        <w:t xml:space="preserve">complaint-handling, offers mediation, and gives representative organizations standing to bring proceedings,</w:t>
-      </w:r>
-      <w:r>
-        <w:t xml:space="preserve"> </w:t>
-      </w:r>
-      <w:r>
-        <w:t xml:space="preserve">which makes it one of the few instruments to attach a channel to a disclosure. The Commission has since</w:t>
-      </w:r>
-      <w:r>
-        <w:t xml:space="preserve"> </w:t>
-      </w:r>
-      <w:r>
-        <w:t xml:space="preserve">proposed to repeal it as part of a wider simplification package (European Commission, 2025a), which would</w:t>
-      </w:r>
-      <w:r>
-        <w:t xml:space="preserve"> </w:t>
-      </w:r>
-      <w:r>
-        <w:t xml:space="preserve">remove the only duty in European law to disclose the main parameters of ranking to the business users being</w:t>
-      </w:r>
-      <w:r>
-        <w:t xml:space="preserve"> </w:t>
-      </w:r>
-      <w:r>
-        <w:t xml:space="preserve">ranked. The Digital Services Act’s recommender transparency runs to a platform’s users and does not replace</w:t>
-      </w:r>
-      <w:r>
-        <w:t xml:space="preserve"> </w:t>
-      </w:r>
-      <w:r>
-        <w:t xml:space="preserve">that duty. High digital sovereignty beside low coordinative sovereignty, and an instrument that built a</w:t>
-      </w:r>
-      <w:r>
-        <w:t xml:space="preserve"> </w:t>
-      </w:r>
-      <w:r>
-        <w:t xml:space="preserve">little of the second now proposed for withdrawal.</w:t>
-      </w:r>
-    </w:p>
-    <w:p>
-      <w:pPr>
-        <w:pStyle w:val="BodyText"/>
-      </w:pPr>
-      <w:r>
-        <w:t xml:space="preserve">The reverse pairing is equally real, and it is still arriving. A platform worker owns none of the</w:t>
-      </w:r>
-      <w:r>
-        <w:t xml:space="preserve"> </w:t>
-      </w:r>
-      <w:r>
-        <w:t xml:space="preserve">infrastructure that coordinates the work. Under the European platform-work directive, member states must by</w:t>
-      </w:r>
-      <w:r>
-        <w:t xml:space="preserve"> </w:t>
-      </w:r>
-      <w:r>
-        <w:t xml:space="preserve">2 December 2026 write in information rights over the automated systems, human review of consequential</w:t>
-      </w:r>
-      <w:r>
-        <w:t xml:space="preserve"> </w:t>
-      </w:r>
-      <w:r>
-        <w:t xml:space="preserve">automated decisions, and limits on the data the platform may process (European Parliament &amp; Council of the</w:t>
-      </w:r>
-      <w:r>
-        <w:t xml:space="preserve"> </w:t>
-      </w:r>
-      <w:r>
-        <w:t xml:space="preserve">European Union, 2024). No member state had fully transposed the directive as this chapter was written, so</w:t>
-      </w:r>
-      <w:r>
-        <w:t xml:space="preserve"> </w:t>
-      </w:r>
-      <w:r>
-        <w:t xml:space="preserve">the standing it describes is a legislative commitment, not yet a present fact. The same directive’s</w:t>
-      </w:r>
-      <w:r>
-        <w:t xml:space="preserve"> </w:t>
-      </w:r>
-      <w:r>
-        <w:t xml:space="preserve">rebuttable presumption of employment, where the platform controls the work, is a different instrument.</w:t>
-      </w:r>
-      <w:r>
-        <w:t xml:space="preserve"> </w:t>
-      </w:r>
-      <w:r>
-        <w:t xml:space="preserve">Where it bites it may move the worker out of a mediated triad and into a hierarchy, which changes the</w:t>
-      </w:r>
-      <w:r>
-        <w:t xml:space="preserve"> </w:t>
-      </w:r>
-      <w:r>
-        <w:t xml:space="preserve">coordination form rather than conferring standing inside it. Article 25 is the voice clause. It obliges</w:t>
-      </w:r>
-      <w:r>
-        <w:t xml:space="preserve"> </w:t>
-      </w:r>
-      <w:r>
-        <w:t xml:space="preserve">member states to promote collective bargaining in platform work, including measures</w:t>
-      </w:r>
-      <w:r>
-        <w:t xml:space="preserve"> </w:t>
-      </w:r>
-      <w:r>
-        <w:t xml:space="preserve">“to facilitate the</w:t>
-      </w:r>
-      <w:r>
-        <w:t xml:space="preserve"> </w:t>
-      </w:r>
-      <w:r>
-        <w:t xml:space="preserve">exercise of their rights related to algorithmic management set out in Chapter III.”</w:t>
-      </w:r>
-      <w:r>
-        <w:t xml:space="preserve"> </w:t>
-      </w:r>
-      <w:r>
-        <w:t xml:space="preserve">A legislature there</w:t>
-      </w:r>
-      <w:r>
-        <w:t xml:space="preserve"> </w:t>
-      </w:r>
-      <w:r>
-        <w:t xml:space="preserve">ties collective voice directly to standing over algorithmic coordination, which is coordinative sovereignty</w:t>
-      </w:r>
-      <w:r>
-        <w:t xml:space="preserve"> </w:t>
-      </w:r>
-      <w:r>
-        <w:t xml:space="preserve">written into law. Member states are building that standing while control of the infrastructure stays at</w:t>
-      </w:r>
-      <w:r>
-        <w:t xml:space="preserve"> </w:t>
-      </w:r>
-      <w:r>
-        <w:t xml:space="preserve">zero.</w:t>
+        <w:t xml:space="preserve">separates two phenomena that vary independently across firms. Digital sovereignty is a literacy construct,</w:t>
+      </w:r>
+      <w:r>
+        <w:t xml:space="preserve"> </w:t>
+      </w:r>
+      <w:r>
+        <w:t xml:space="preserve">measuring an organization’s capacity to read and control its data, infrastructure, and code. Coordinative</w:t>
+      </w:r>
+      <w:r>
+        <w:t xml:space="preserve"> </w:t>
+      </w:r>
+      <w:r>
+        <w:t xml:space="preserve">sovereignty is an algorithmacy construct, measuring an organization’s standing within the algorithmic</w:t>
+      </w:r>
+      <w:r>
+        <w:t xml:space="preserve"> </w:t>
+      </w:r>
+      <w:r>
+        <w:t xml:space="preserve">coordination on which it depends. A firm can be high on the first and low on the second, impeccably</w:t>
+      </w:r>
+      <w:r>
+        <w:t xml:space="preserve"> </w:t>
+      </w:r>
+      <w:r>
+        <w:t xml:space="preserve">compliant and strategically captured, and the two predict different outcomes.</w:t>
+      </w:r>
+    </w:p>
+    <w:p>
+      <w:pPr>
+        <w:pStyle w:val="BodyText"/>
+      </w:pPr>
+      <w:r>
+        <w:t xml:space="preserve">An application developer or a marketplace seller can own its code and data, hold data-portability rights,</w:t>
+      </w:r>
+      <w:r>
+        <w:t xml:space="preserve"> </w:t>
+      </w:r>
+      <w:r>
+        <w:t xml:space="preserve">and comply fully with the GDPR and the Digital Markets Act, and still hold no leverage over the ranking and</w:t>
+      </w:r>
+      <w:r>
+        <w:t xml:space="preserve"> </w:t>
+      </w:r>
+      <w:r>
+        <w:t xml:space="preserve">review algorithms that set its visibility (Cutolo &amp; Kenney, 2021). Enforcement has reached platform conduct</w:t>
+      </w:r>
+      <w:r>
+        <w:t xml:space="preserve"> </w:t>
+      </w:r>
+      <w:r>
+        <w:t xml:space="preserve">without reaching that layer: the European Commission fined Apple €500 million in April 2025 for restricting</w:t>
+      </w:r>
+      <w:r>
+        <w:t xml:space="preserve"> </w:t>
+      </w:r>
+      <w:r>
+        <w:t xml:space="preserve">how developers steer users to offers outside its App Store (European Commission, 2025b), a decision Apple</w:t>
+      </w:r>
+      <w:r>
+        <w:t xml:space="preserve"> </w:t>
+      </w:r>
+      <w:r>
+        <w:t xml:space="preserve">has appealed (Case T-438/25). Ranking transparency is a separate and earlier obligation, set by the 2019</w:t>
+      </w:r>
+      <w:r>
+        <w:t xml:space="preserve"> </w:t>
+      </w:r>
+      <w:r>
+        <w:t xml:space="preserve">Platform-to-Business Regulation and the Digital Services Act. That Regulation does more than disclose,</w:t>
+      </w:r>
+      <w:r>
+        <w:t xml:space="preserve"> </w:t>
+      </w:r>
+      <w:r>
+        <w:t xml:space="preserve">since it also requires internal complaint-handling, offers mediation, and gives representative</w:t>
+      </w:r>
+      <w:r>
+        <w:t xml:space="preserve"> </w:t>
+      </w:r>
+      <w:r>
+        <w:t xml:space="preserve">organizations standing to bring proceedings, which makes it one of the few instruments to attach a channel</w:t>
+      </w:r>
+      <w:r>
+        <w:t xml:space="preserve"> </w:t>
+      </w:r>
+      <w:r>
+        <w:t xml:space="preserve">to a disclosure. The Commission has since proposed to repeal it as part of a wider simplification package</w:t>
+      </w:r>
+      <w:r>
+        <w:t xml:space="preserve"> </w:t>
+      </w:r>
+      <w:r>
+        <w:t xml:space="preserve">(European Commission, 2025a), which would remove the only duty in European law to disclose the main</w:t>
+      </w:r>
+      <w:r>
+        <w:t xml:space="preserve"> </w:t>
+      </w:r>
+      <w:r>
+        <w:t xml:space="preserve">parameters of ranking to the business users being ranked. The Digital Services Act’s recommender</w:t>
+      </w:r>
+      <w:r>
+        <w:t xml:space="preserve"> </w:t>
+      </w:r>
+      <w:r>
+        <w:t xml:space="preserve">transparency runs to a platform’s users and does not replace that duty. High digital sovereignty beside low</w:t>
+      </w:r>
+      <w:r>
+        <w:t xml:space="preserve"> </w:t>
+      </w:r>
+      <w:r>
+        <w:t xml:space="preserve">coordinative sovereignty, and an instrument that built a little of the second now proposed for withdrawal.</w:t>
+      </w:r>
+    </w:p>
+    <w:p>
+      <w:pPr>
+        <w:pStyle w:val="BodyText"/>
+      </w:pPr>
+      <w:r>
+        <w:t xml:space="preserve">The reverse pairing is still arriving: a platform worker owns none of the infrastructure that coordinates</w:t>
+      </w:r>
+      <w:r>
+        <w:t xml:space="preserve"> </w:t>
+      </w:r>
+      <w:r>
+        <w:t xml:space="preserve">the work. Under the European platform-work directive, member states must by 2 December 2026 write in</w:t>
+      </w:r>
+      <w:r>
+        <w:t xml:space="preserve"> </w:t>
+      </w:r>
+      <w:r>
+        <w:t xml:space="preserve">information rights over the automated systems, human review of consequential automated decisions, and</w:t>
+      </w:r>
+      <w:r>
+        <w:t xml:space="preserve"> </w:t>
+      </w:r>
+      <w:r>
+        <w:t xml:space="preserve">limits on the data the platform may process (European Parliament &amp; Council of the European Union, 2024). No</w:t>
+      </w:r>
+      <w:r>
+        <w:t xml:space="preserve"> </w:t>
+      </w:r>
+      <w:r>
+        <w:t xml:space="preserve">member state had fully transposed the directive as this chapter was written, so the standing it describes</w:t>
+      </w:r>
+      <w:r>
+        <w:t xml:space="preserve"> </w:t>
+      </w:r>
+      <w:r>
+        <w:t xml:space="preserve">is a legislative commitment, not yet a present fact. The same directive’s rebuttable presumption of</w:t>
+      </w:r>
+      <w:r>
+        <w:t xml:space="preserve"> </w:t>
+      </w:r>
+      <w:r>
+        <w:t xml:space="preserve">employment, where the platform controls the work, is a different instrument. Where it bites it may move the</w:t>
+      </w:r>
+      <w:r>
+        <w:t xml:space="preserve"> </w:t>
+      </w:r>
+      <w:r>
+        <w:t xml:space="preserve">worker out of a mediated triad and into a hierarchy, which changes the coordination form rather than</w:t>
+      </w:r>
+      <w:r>
+        <w:t xml:space="preserve"> </w:t>
+      </w:r>
+      <w:r>
+        <w:t xml:space="preserve">conferring standing inside it. Article 25 is the voice clause. It obliges member states to promote</w:t>
+      </w:r>
+      <w:r>
+        <w:t xml:space="preserve"> </w:t>
+      </w:r>
+      <w:r>
+        <w:t xml:space="preserve">collective bargaining in platform work, including measures</w:t>
+      </w:r>
+      <w:r>
+        <w:t xml:space="preserve"> </w:t>
+      </w:r>
+      <w:r>
+        <w:t xml:space="preserve">“to facilitate the exercise of their rights</w:t>
+      </w:r>
+      <w:r>
+        <w:t xml:space="preserve"> </w:t>
+      </w:r>
+      <w:r>
+        <w:t xml:space="preserve">related to algorithmic management set out in Chapter III.”</w:t>
+      </w:r>
+      <w:r>
+        <w:t xml:space="preserve"> </w:t>
+      </w:r>
+      <w:r>
+        <w:t xml:space="preserve">A legislature there ties collective voice</w:t>
+      </w:r>
+      <w:r>
+        <w:t xml:space="preserve"> </w:t>
+      </w:r>
+      <w:r>
+        <w:t xml:space="preserve">directly to standing over algorithmic coordination, which is coordinative sovereignty written into law.</w:t>
+      </w:r>
+      <w:r>
+        <w:t xml:space="preserve"> </w:t>
+      </w:r>
+      <w:r>
+        <w:t xml:space="preserve">Member states are building that standing while control of the infrastructure stays at zero.</w:t>
       </w:r>
     </w:p>
     <w:p>
@@ -4929,37 +4887,37 @@
         <w:t xml:space="preserve"> </w:t>
       </w:r>
       <w:r>
-        <w:t xml:space="preserve">compliance secures a digital position and does not acquire standing over the algorithmic</w:t>
-      </w:r>
-      <w:r>
-        <w:t xml:space="preserve"> </w:t>
-      </w:r>
-      <w:r>
-        <w:t xml:space="preserve">determinations that set its market outcomes. The exposure is an algorithmacy gap, and the diagnostic gives</w:t>
-      </w:r>
-      <w:r>
-        <w:t xml:space="preserve"> </w:t>
-      </w:r>
-      <w:r>
-        <w:t xml:space="preserve">managers a decision procedure for it. Where the firm depends on a contingent mediator, the move is toward</w:t>
-      </w:r>
-      <w:r>
-        <w:t xml:space="preserve"> </w:t>
-      </w:r>
-      <w:r>
-        <w:t xml:space="preserve">exit: support interoperability, build or back an alternative, break the lock-in. Where it depends on a</w:t>
-      </w:r>
-      <w:r>
-        <w:t xml:space="preserve"> </w:t>
-      </w:r>
-      <w:r>
-        <w:t xml:space="preserve">necessary mediator, exit is closed and the move is toward voice: organize with other dependent firms, pool</w:t>
-      </w:r>
-      <w:r>
-        <w:t xml:space="preserve"> </w:t>
-      </w:r>
-      <w:r>
-        <w:t xml:space="preserve">data, demand contestable systems, seek a standing channel of governance. Treating a necessary mediator as</w:t>
+        <w:t xml:space="preserve">compliance secures a digital position and does not acquire standing over the algorithmic determinations</w:t>
+      </w:r>
+      <w:r>
+        <w:t xml:space="preserve"> </w:t>
+      </w:r>
+      <w:r>
+        <w:t xml:space="preserve">that set its market outcomes. The exposure is an algorithmacy gap, and the diagnostic gives managers a</w:t>
+      </w:r>
+      <w:r>
+        <w:t xml:space="preserve"> </w:t>
+      </w:r>
+      <w:r>
+        <w:t xml:space="preserve">decision procedure for it. Where the firm depends on a contingent mediator, the move is toward exit:</w:t>
+      </w:r>
+      <w:r>
+        <w:t xml:space="preserve"> </w:t>
+      </w:r>
+      <w:r>
+        <w:t xml:space="preserve">support interoperability, build or back an alternative, break the lock-in. Where it depends on a necessary</w:t>
+      </w:r>
+      <w:r>
+        <w:t xml:space="preserve"> </w:t>
+      </w:r>
+      <w:r>
+        <w:t xml:space="preserve">mediator, exit is closed and the move is toward voice: organize with other dependent firms, pool data,</w:t>
+      </w:r>
+      <w:r>
+        <w:t xml:space="preserve"> </w:t>
+      </w:r>
+      <w:r>
+        <w:t xml:space="preserve">demand contestable systems, seek a standing channel of governance. Treating a necessary mediator as</w:t>
       </w:r>
       <w:r>
         <w:t xml:space="preserve"> </w:t>
@@ -5163,15 +5121,21 @@
         <w:pStyle w:val="FirstParagraph"/>
       </w:pPr>
       <w:r>
-        <w:t xml:space="preserve">The empirical program begins with measurement. Four directions follow, in rough order of dependence.</w:t>
-      </w:r>
-    </w:p>
-    <w:p>
-      <w:pPr>
-        <w:pStyle w:val="BodyText"/>
-      </w:pPr>
-      <w:r>
-        <w:t xml:space="preserve">The first is a validated instrument for algorithmacy. Its three dimensions point to a multidimensional</w:t>
+        <w:t xml:space="preserve">The two sovereignties do not track each other; whether a firm is high on one and low on the other is now a</w:t>
+      </w:r>
+      <w:r>
+        <w:t xml:space="preserve"> </w:t>
+      </w:r>
+      <w:r>
+        <w:t xml:space="preserve">measurement question. Four directions follow, in rough order of dependence.</w:t>
+      </w:r>
+    </w:p>
+    <w:p>
+      <w:pPr>
+        <w:pStyle w:val="BodyText"/>
+      </w:pPr>
+      <w:r>
+        <w:t xml:space="preserve">The first is a validated instrument for algorithmacy, whose three dimensions point to a multidimensional</w:t>
       </w:r>
       <w:r>
         <w:t xml:space="preserve"> </w:t>
@@ -5227,7 +5191,7 @@
         <w:pStyle w:val="BodyText"/>
       </w:pPr>
       <w:r>
-        <w:t xml:space="preserve">The second is a validated instrument for coordinative sovereignty. Its standing dimensions — freedom from</w:t>
+        <w:t xml:space="preserve">The second is a validated instrument for coordinative sovereignty, whose standing dimensions — freedom from</w:t>
       </w:r>
       <w:r>
         <w:t xml:space="preserve"> </w:t>
@@ -5269,39 +5233,39 @@
         <w:t xml:space="preserve"> </w:t>
       </w:r>
       <w:r>
-        <w:t xml:space="preserve">standing withheld by switching costs alone. Republican theory offers a usable test item</w:t>
-      </w:r>
-      <w:r>
-        <w:t xml:space="preserve"> </w:t>
-      </w:r>
-      <w:r>
-        <w:t xml:space="preserve">in the form of the question whether an actor can look the mediator in the eye and speak plainly, without</w:t>
-      </w:r>
-      <w:r>
-        <w:t xml:space="preserve"> </w:t>
-      </w:r>
-      <w:r>
-        <w:t xml:space="preserve">needing to ingratiate or to avoid provoking a power that could retaliate. Because the construct has both an</w:t>
-      </w:r>
-      <w:r>
-        <w:t xml:space="preserve"> </w:t>
-      </w:r>
-      <w:r>
-        <w:t xml:space="preserve">individual and an organizational bearer, the instrument needs a form at each level, and their</w:t>
-      </w:r>
-      <w:r>
-        <w:t xml:space="preserve"> </w:t>
-      </w:r>
-      <w:r>
-        <w:t xml:space="preserve">correspondence is itself a question.</w:t>
-      </w:r>
-    </w:p>
-    <w:p>
-      <w:pPr>
-        <w:pStyle w:val="BodyText"/>
-      </w:pPr>
-      <w:r>
-        <w:t xml:space="preserve">The third is the two-step design the diagnostic affords. Because the necessary/contingent distinction can</w:t>
+        <w:t xml:space="preserve">standing withheld by switching costs alone. Republican theory offers a usable test item in the form of the</w:t>
+      </w:r>
+      <w:r>
+        <w:t xml:space="preserve"> </w:t>
+      </w:r>
+      <w:r>
+        <w:t xml:space="preserve">question whether an actor can look the mediator in the eye and speak plainly, without needing to ingratiate</w:t>
+      </w:r>
+      <w:r>
+        <w:t xml:space="preserve"> </w:t>
+      </w:r>
+      <w:r>
+        <w:t xml:space="preserve">or to avoid provoking a power that could retaliate. Because the construct has both an individual and an</w:t>
+      </w:r>
+      <w:r>
+        <w:t xml:space="preserve"> </w:t>
+      </w:r>
+      <w:r>
+        <w:t xml:space="preserve">organizational bearer, the instrument needs a form at each level, and their correspondence is itself a</w:t>
+      </w:r>
+      <w:r>
+        <w:t xml:space="preserve"> </w:t>
+      </w:r>
+      <w:r>
+        <w:t xml:space="preserve">question.</w:t>
+      </w:r>
+    </w:p>
+    <w:p>
+      <w:pPr>
+        <w:pStyle w:val="BodyText"/>
+      </w:pPr>
+      <w:r>
+        <w:t xml:space="preserve">The third is the two-step design the diagnostic affords: because the necessary/contingent distinction can</w:t>
       </w:r>
       <w:r>
         <w:t xml:space="preserve"> </w:t>
@@ -5339,31 +5303,31 @@
         <w:pStyle w:val="BodyText"/>
       </w:pPr>
       <w:r>
-        <w:t xml:space="preserve">The fourth is the correspondence between reported and afforded standing. Coordinative sovereignty can be</w:t>
-      </w:r>
-      <w:r>
-        <w:t xml:space="preserve"> </w:t>
-      </w:r>
-      <w:r>
-        <w:t xml:space="preserve">operationalized twice: as a survey of the standing an actor reports, and as a structural property of a</w:t>
-      </w:r>
-      <w:r>
-        <w:t xml:space="preserve"> </w:t>
-      </w:r>
-      <w:r>
-        <w:t xml:space="preserve">formal model of the actor’s coordination, developed in the companion paper (Author, 2026). Whether actors</w:t>
-      </w:r>
-      <w:r>
-        <w:t xml:space="preserve"> </w:t>
-      </w:r>
-      <w:r>
-        <w:t xml:space="preserve">who report high coordinative sovereignty are those a model would place as pivotal is a construct-validity</w:t>
-      </w:r>
-      <w:r>
-        <w:t xml:space="preserve"> </w:t>
-      </w:r>
-      <w:r>
-        <w:t xml:space="preserve">test a self-report alone cannot supply.</w:t>
+        <w:t xml:space="preserve">The fourth is the correspondence between reported and afforded standing, operationalized twice: as a survey</w:t>
+      </w:r>
+      <w:r>
+        <w:t xml:space="preserve"> </w:t>
+      </w:r>
+      <w:r>
+        <w:t xml:space="preserve">of the standing an actor reports, and as a structural property of a formal model of the actor’s</w:t>
+      </w:r>
+      <w:r>
+        <w:t xml:space="preserve"> </w:t>
+      </w:r>
+      <w:r>
+        <w:t xml:space="preserve">coordination, developed in the companion paper (Author, 2026). Whether actors who report high coordinative</w:t>
+      </w:r>
+      <w:r>
+        <w:t xml:space="preserve"> </w:t>
+      </w:r>
+      <w:r>
+        <w:t xml:space="preserve">sovereignty are those a model would place as pivotal is a construct-validity test a self-report alone</w:t>
+      </w:r>
+      <w:r>
+        <w:t xml:space="preserve"> </w:t>
+      </w:r>
+      <w:r>
+        <w:t xml:space="preserve">cannot supply.</w:t>
       </w:r>
     </w:p>
     <w:p>
@@ -5485,25 +5449,25 @@
         <w:t xml:space="preserve"> </w:t>
       </w:r>
       <w:r>
-        <w:t xml:space="preserve">system that interprets it and commits its outcomes. The competence equal to that medium is algorithmacy,</w:t>
-      </w:r>
-      <w:r>
-        <w:t xml:space="preserve"> </w:t>
-      </w:r>
-      <w:r>
-        <w:t xml:space="preserve">and the standing it makes possible is coordinative sovereignty: effective voice within a necessary</w:t>
-      </w:r>
-      <w:r>
-        <w:t xml:space="preserve"> </w:t>
-      </w:r>
-      <w:r>
-        <w:t xml:space="preserve">mediation, an arrangement the open tie does not dissolve, carried far enough to be a share in how that</w:t>
-      </w:r>
-      <w:r>
-        <w:t xml:space="preserve"> </w:t>
-      </w:r>
-      <w:r>
-        <w:t xml:space="preserve">coordination is governed.</w:t>
+        <w:t xml:space="preserve">system that interprets it and commits its outcomes. The competence equal to that medium is algorithmacy.</w:t>
+      </w:r>
+      <w:r>
+        <w:t xml:space="preserve"> </w:t>
+      </w:r>
+      <w:r>
+        <w:t xml:space="preserve">Where a mediator still binds after the parties can reach each other, the standing that competence can make</w:t>
+      </w:r>
+      <w:r>
+        <w:t xml:space="preserve"> </w:t>
+      </w:r>
+      <w:r>
+        <w:t xml:space="preserve">effective is coordinative sovereignty: voice within that mediation, carried far enough to be a share in how</w:t>
+      </w:r>
+      <w:r>
+        <w:t xml:space="preserve"> </w:t>
+      </w:r>
+      <w:r>
+        <w:t xml:space="preserve">the coordination is governed.</w:t>
       </w:r>
     </w:p>
     <w:p>

</xml_diff>